<commit_message>
style: Upgrade textbook UI/UX with full illustrated cover, table protection, and dedicated QA audit page
</commit_message>
<xml_diff>
--- a/ALL_IN_ONE_GPT_SETUP/KNOWLEDGE_FILES/00_REFERENCE_TEXTBOOK_BENCHMARK.docx
+++ b/ALL_IN_ONE_GPT_SETUP/KNOWLEDGE_FILES/00_REFERENCE_TEXTBOOK_BENCHMARK.docx
@@ -4,7 +4,7 @@
   <w:body>
     <w:p>
       <w:pPr>
-        <w:spacing w:before="200" w:after="40" w:line="276" w:lineRule="auto"/>
+        <w:spacing w:before="80" w:after="120" w:line="276" w:lineRule="auto"/>
         <w:jc w:val="center"/>
       </w:pPr>
       <w:r>
@@ -12,7 +12,7 @@
           <w:rFonts w:ascii="Arial" w:hAnsi="Arial"/>
           <w:b/>
           <w:color w:val="1B365D"/>
-          <w:sz w:val="22"/>
+          <w:sz w:val="20"/>
         </w:rPr>
         <w:t>REPUBLIKA NG PILIPINAS • KAGAWARAN NG EDUKASYON</w:t>
         <w:br/>
@@ -21,111 +21,47 @@
     </w:p>
     <w:p>
       <w:pPr>
-        <w:spacing w:before="480" w:after="120" w:line="276" w:lineRule="auto"/>
+        <w:spacing w:before="120" w:after="160" w:line="276" w:lineRule="auto"/>
         <w:jc w:val="center"/>
       </w:pPr>
       <w:r>
-        <w:rPr>
-          <w:rFonts w:ascii="Cambria" w:hAnsi="Cambria"/>
-          <w:b/>
-          <w:color w:val="1B365D"/>
-          <w:sz w:val="52"/>
-        </w:rPr>
-        <w:t>GABAY PAMPAGKATUTO SA FILIPINO 7</w:t>
+        <w:drawing>
+          <wp:inline xmlns:a="http://schemas.openxmlformats.org/drawingml/2006/main" xmlns:pic="http://schemas.openxmlformats.org/drawingml/2006/picture">
+            <wp:extent cx="4937760" cy="6613071"/>
+            <wp:docPr id="1" name="Picture 1"/>
+            <wp:cNvGraphicFramePr>
+              <a:graphicFrameLocks noChangeAspect="1"/>
+            </wp:cNvGraphicFramePr>
+            <a:graphic>
+              <a:graphicData uri="http://schemas.openxmlformats.org/drawingml/2006/picture">
+                <pic:pic>
+                  <pic:nvPicPr>
+                    <pic:cNvPr id="0" name="SAMPLE_FULL_TITLE_COVER.jpg"/>
+                    <pic:cNvPicPr/>
+                  </pic:nvPicPr>
+                  <pic:blipFill>
+                    <a:blip r:embed="rId11"/>
+                    <a:stretch>
+                      <a:fillRect/>
+                    </a:stretch>
+                  </pic:blipFill>
+                  <pic:spPr>
+                    <a:xfrm>
+                      <a:off x="0" y="0"/>
+                      <a:ext cx="4937760" cy="6613071"/>
+                    </a:xfrm>
+                    <a:prstGeom prst="rect"/>
+                  </pic:spPr>
+                </pic:pic>
+              </a:graphicData>
+            </a:graphic>
+          </wp:inline>
+        </w:drawing>
       </w:r>
     </w:p>
     <w:p>
       <w:pPr>
-        <w:spacing w:before="80" w:after="480" w:line="276" w:lineRule="auto"/>
-        <w:jc w:val="center"/>
-      </w:pPr>
-      <w:r>
-        <w:rPr>
-          <w:rFonts w:ascii="Cambria" w:hAnsi="Cambria"/>
-          <w:b/>
-          <w:color w:val="555555"/>
-          <w:sz w:val="26"/>
-        </w:rPr>
-        <w:t>YUNIT III: AKO AT ANG AKING PAGKATAO, TANGLAW NG KATATAGAN</w:t>
-        <w:br/>
-        <w:t>Panitikan sa Panahon ng Pananakop ng Espanya • Tekstong Pampahayagan • Wika at Multimodal</w:t>
-      </w:r>
-    </w:p>
-    <w:tbl>
-      <w:tblPr>
-        <w:tblW w:type="auto" w:w="0"/>
-        <w:jc w:val="center"/>
-        <w:tblLook w:firstColumn="1" w:firstRow="1" w:lastColumn="0" w:lastRow="0" w:noHBand="0" w:noVBand="1" w:val="04A0"/>
-      </w:tblPr>
-      <w:tblGrid>
-        <w:gridCol w:w="9936"/>
-      </w:tblGrid>
-      <w:tr>
-        <w:tc>
-          <w:tcPr>
-            <w:tcW w:type="dxa" w:w="9936"/>
-            <w:shd w:fill="FAFAFA"/>
-            <w:tcBorders>
-              <w:top w:val="dashed" w:sz="12" w:space="0" w:color="CCCCCC"/>
-              <w:left w:val="dashed" w:sz="12" w:space="0" w:color="CCCCCC"/>
-              <w:bottom w:val="dashed" w:sz="12" w:space="0" w:color="CCCCCC"/>
-              <w:right w:val="dashed" w:sz="12" w:space="0" w:color="CCCCCC"/>
-            </w:tcBorders>
-            <w:tcMar>
-              <w:top w:w="120" w:type="dxa"/>
-              <w:bottom w:w="120" w:type="dxa"/>
-              <w:left w:w="160" w:type="dxa"/>
-              <w:right w:w="160" w:type="dxa"/>
-            </w:tcMar>
-          </w:tcPr>
-          <w:p>
-            <w:pPr>
-              <w:spacing w:before="0" w:after="40" w:line="276" w:lineRule="auto"/>
-              <w:jc w:val="left"/>
-            </w:pPr>
-            <w:r>
-              <w:rPr>
-                <w:rFonts w:ascii="Arial" w:hAnsi="Arial"/>
-                <w:b/>
-                <w:color w:val="444444"/>
-                <w:sz w:val="20"/>
-              </w:rPr>
-              <w:t>📷 [PROMPT SA PAGBUO NG LARAWAN SA PABALAT (FRONT COVER AI IMAGE PROMPT)]  Detailed Image Generation Prompt</w:t>
-            </w:r>
-          </w:p>
-          <w:p>
-            <w:pPr>
-              <w:spacing w:before="0" w:after="0" w:line="276" w:lineRule="auto"/>
-              <w:jc w:val="left"/>
-            </w:pPr>
-            <w:r>
-              <w:rPr>
-                <w:rFonts w:ascii="Cambria" w:hAnsi="Cambria"/>
-                <w:i/>
-                <w:color w:val="333333"/>
-                <w:sz w:val="19"/>
-              </w:rPr>
-              <w:t>PAMAGAT NG AKLAT: Gabay Pampagkatuto sa Filipino 7</w:t>
-              <w:br/>
-              <w:t>BAITANG AT YUNIT: Filipino Baitang 7 • Yunit III: 'Ako at ang Aking Pagkatao, Tanglaw ng Katatagan'</w:t>
-              <w:br/>
-              <w:t>PAKSA: Panitikan sa Panahon ng Espanya • Tekstong Pampahayagan • Wika at Multimodal</w:t>
-              <w:br/>
-              <w:br/>
-              <w:t>AI IMAGE PROMPT: A prestigious, high-end educational textbook cover layout. At the top of the cover, a sleek deep navy blue graphic banner featuring clean, crisp, perfectly rendered typography. The primary headline in bold white capital letters reads: 'GABAY PAMPAGKATUTO SA FILIPINO 7'. Below it, a secondary title in elegant warm gold letters reads: 'YUNIT III: AKO AT ANG AKING PAGKATAO, TANGLAW NG KATATAGAN'. Beneath in subtle light silver text: 'Panitikan sa Panahon ng Espanya • Tekstong Pampahayagan • Wika at Multimodal'. In the lower two-thirds illustration, two Filipino Grade 7 students (a 13-year-old boy and girl in neat modern school uniforms) studying together at a wooden table under warm golden morning light with an open book and study materials. In the background, a historic Spanish-colonial stone church belfry and majestic Philippine mountains under a luminous sunrise. Clean textbook graphic design, perfectly centered professional typography, ultra-high resolution, no gibberish text, no watermarks, no logos --ar 8.5:11 --v 6.0</w:t>
-            </w:r>
-          </w:p>
-        </w:tc>
-      </w:tr>
-    </w:tbl>
-    <w:p>
-      <w:pPr>
-        <w:spacing w:after="40"/>
-      </w:pPr>
-    </w:p>
-    <w:p>
-      <w:pPr>
-        <w:spacing w:before="720" w:after="40" w:line="276" w:lineRule="auto"/>
+        <w:spacing w:before="160" w:after="0" w:line="276" w:lineRule="auto"/>
         <w:jc w:val="center"/>
       </w:pPr>
       <w:r>
@@ -133,11 +69,9 @@
           <w:rFonts w:ascii="Arial" w:hAnsi="Arial"/>
           <w:b/>
           <w:color w:val="1B365D"/>
-          <w:sz w:val="20"/>
+          <w:sz w:val="19"/>
         </w:rPr>
-        <w:t>Edisyong Pampubliko para sa mga Paaralang MATATAG</w:t>
-        <w:br/>
-        <w:t>Nakaayon sa MATATAG 21st Century Literacy Framework</w:t>
+        <w:t>Edisyong Pampubliko para sa mga Paaralang MATATAG • 21st Century Literacy Framework</w:t>
       </w:r>
     </w:p>
     <w:p>
@@ -163,6 +97,10 @@
         <w:gridCol w:w="9936"/>
       </w:tblGrid>
       <w:tr>
+        <w:trPr>
+          <w:cantSplit/>
+          <w:tblHeader/>
+        </w:trPr>
         <w:tc>
           <w:tcPr>
             <w:tcW w:type="dxa" w:w="9936"/>
@@ -208,7 +146,7 @@
           <w:color w:val="222222"/>
           <w:sz w:val="21"/>
         </w:rPr>
-        <w:t>Malugod na inihahandog ang Yunit III ng Gabay Pampagkatuto sa Filipino 7 na may paksang "Ako at ang Aking Pagkatao, Tanglaw ng Katatagan." Ang kagamitang pampagtuturong ito ay masusing idinisenyo upang magsilbing komprehensibo, siyentipiko, at makabuluhang patnubay para sa mga mag-aaral ng Ikapitong Baitang sa ilalim ng bagong Kurikulum na MATATAG ng Kagawaran ng Edukasyon. Sa pamamagitan ng masinsing pag-aaral sa mga tekstong umusbong at lumaganap sa Panahon ng Pananakop ng Espanya, layunin ng aklat na ito na linangin ang kritikal na pag-unawa, mapanuring pag-iisip, at pambansang kamalayan ng mga kabataang Pilipino.</w:t>
+        <w:t>Malugod na inihahandog ang Yunit III ng Gabay Pampagkatuto sa Filipino 7 na may paksang "Ako at ang Aking Pagkatao, Tanglaw ng Katatagan." Binuo ang kagamitang pampagtuturong ito alinsunod sa bagong Kurikulum ng MATATAG ng Kagawaran ng Edukasyon (DepEd) upang matugunan ang panawagan para sa mas malalim, makabuluhan, at mapanuring literasiya sa ika-21 siglo.</w:t>
       </w:r>
     </w:p>
     <w:p>
@@ -222,7 +160,7 @@
           <w:color w:val="222222"/>
           <w:sz w:val="21"/>
         </w:rPr>
-        <w:t>Ang Yunit III ay buong-buong nakaangkla sa mga Pamantayang Pangnilalaman at Pamantayan sa Pagganap para sa Ikatlong Markahan. Binibigyang-diin sa yunit na ito ang masusing pagsusuri sa panitikan hindi lamang bilang hiwalay na mga likhang-sining, kundi bilang mga buháy na bakas ng ating kasaysayan, kultura, wika, at pagkakakilanlan. Dito ay tutuklasin ng mga mag-aaral kung paano nakipagtagpo ang katutubong kamalayan sa mga banyagang impluwensiya, kung paano ginamit ang panitikan sa pananakop at pananampalataya, at kung paano patuloy na nagpamalas ng katatagan at sariling tinig ang mga Pilipino sa kabila ng kolonyalismong Espanyol.</w:t>
+        <w:t>Nakasalig ang aklat na ito sa 70% Aralin / 30% Gawain na Pedagohikal na Modelo. Ipinauuna ang malalim na pagkaunawa sa kontekstong historikal, kultural, at lingguwistiko bago ilatag ang mga paglalapat. Sa Yunit na ito, tinatalakay ang Panitikan sa Panahon ng Pananakop ng Espanya bilang lunsaran ng pagbuo ng sariling kamalayan at pagkakakilanlan ng kabataang Pilipino.</w:t>
       </w:r>
     </w:p>
     <w:p>
@@ -236,7 +174,7 @@
           <w:color w:val="222222"/>
           <w:sz w:val="21"/>
         </w:rPr>
-        <w:t>Mahigpit na ipinapatupad sa aklat na ito ang Prinsipyo ng 70/30 Balangkas Pedagohikal: 70% ng bawat aralin ay nakatuon sa malalim na masterclass lecture, kontekstuwalisadong pagsusuri ng lunsarang teksto, teoretikal na pagpapaliwanag, at Socratic na talakayan; samantalang ang 30% ay inilaan sa masinsing aplikasyon, pagsasanay, autentikong gawaing pagganap, at komprehensibong pagtataya. Sa bawat hakbang, nauuna ang matibay na ebidensiya bago ang interpretasyon, upang sanayin ang mga mag-aaral na maging responsable at mapanuring mambabasa sa digital at multimodal na panahon.</w:t>
+        <w:t>Itinatampok sa tatlong pangunahing aralin ang sumusunod: (1) Aralin 13 – Pag-aaral sa Pagsilang ng Limbag na Panitikan, Doctrina Christiana, at Tekstong Pampahayagan; (2) Aralin 14 – Pagsusuri sa Pasyon, Pasyon Pilapil, Tradisyong Pabasa, at Paglaganap ng Komiks-Brochure; at (3) Aralin 15 – Pagsusuring Kritikal sa Urbana at Feliza ni Modesto de Castro, Ebolusyon ng Kodigo ng Kagandahang-Asal, at Pagbuo ng Mapanuring Sanaysay.</w:t>
       </w:r>
     </w:p>
     <w:p>
@@ -250,7 +188,7 @@
           <w:color w:val="222222"/>
           <w:sz w:val="21"/>
         </w:rPr>
-        <w:t>Sa Aralin 13, magsisilbing saligan ang kaligirang pangkasaysayan ng panitikan, nailathalang balita, panghihiram at pagtutumbas ng salita, at representasyon ng etnisidad. Sa Aralin 14, hihimayin ang Pasyon bilang akdang panrelihiyon, mga pahayagan noong panahon ng Espanyol, wikang nasusulat, at antas ng pamumuhay. Sa Aralin 15, susuriin ang Urbana at Feliza tungkol sa Kalinisan, pagkuha ng impormasyon para sa balita, wikang gamit sa panayam, representasyon ng kababaihan, at pagwawasto ng gramatika sa comic book brochure.</w:t>
+        <w:t>Bawat aralin ay maingat na binalangkas sa sampung (10) magkakaugnay na seksiyon: Mula sa pagganyak, malalim na teorya, autentikong lunsaran, Socratic Seminar, pagsasanay na may gabay, awtentikong pagganap (GRASPS) na may 4x4 analitikong rubrik, metacognitive ticket, hanggang sa 15-item na mabilisang pagsusulit.</w:t>
       </w:r>
     </w:p>
     <w:tbl>
@@ -263,6 +201,10 @@
         <w:gridCol w:w="9936"/>
       </w:tblGrid>
       <w:tr>
+        <w:trPr>
+          <w:cantSplit/>
+          <w:tblHeader/>
+        </w:trPr>
         <w:tc>
           <w:tcPr>
             <w:tcW w:type="dxa" w:w="9936"/>
@@ -292,7 +234,7 @@
                 <w:color w:val="1B365D"/>
                 <w:sz w:val="21"/>
               </w:rPr>
-              <w:t>PAALALA SA KARAPATANG-SIPI AT PAGGAMIT NG MATERYAL:</w:t>
+              <w:t>TALA SA DISENYO AT PRODUKSIYON NG PABALAT (COVER ART SPECIFICATION)</w:t>
             </w:r>
           </w:p>
           <w:p>
@@ -305,7 +247,20 @@
                 <w:rFonts w:ascii="Cambria" w:hAnsi="Cambria"/>
                 <w:sz w:val="20"/>
               </w:rPr>
-              <w:t>Ang aklat na ito ay nilikha para sa layuning pang-edukasyon at pampubliko alinsunod sa mga pamantayan ng DepEd MATATAG Curriculum. Ang mga tekstong pampanitikan, sipi mula sa makasaysayang mga dokumento, at multimodal na mga sanggunian ay kinikilala bilang pangunahing batis at pinagkunan. Ipinagbabawal ang paggamit ng materyal na ito para sa komersiyal na kapakinabangan nang walang kaukulang pahintulot.</w:t>
+              <w:t>PROMPT SA MIDJOURNEY / DALL-E (COVER ART DIRECTIVE):</w:t>
+            </w:r>
+          </w:p>
+          <w:p>
+            <w:pPr>
+              <w:spacing w:before="0" w:after="40" w:line="276" w:lineRule="auto"/>
+              <w:jc w:val="left"/>
+            </w:pPr>
+            <w:r>
+              <w:rPr>
+                <w:rFonts w:ascii="Cambria" w:hAnsi="Cambria"/>
+                <w:sz w:val="20"/>
+              </w:rPr>
+              <w:t>A prestigious, high-end educational textbook cover layout. At the top of the cover, a sleek deep navy blue graphic banner featuring clean, crisp typography. The primary headline in bold white capital letters reads: "GABAY PAMPAGKATUTO SA FILIPINO 7". Below it, a secondary title in elegant warm gold letters reads: "YUNIT III: AKO AT ANG AKING PAGKATAO, TANGLAW NG KATATAGAN". Beneath in subtle light silver text: "Panitikan sa Panahon ng Espanya • Tekstong Pampahayagan • Wika at Multimodal". In the lower two-thirds illustration, two Filipino Grade 7 students (13-year-old boy and girl in neat modern school uniforms) studying together at a wooden desk with books under warm golden morning light. In the background, a historic Spanish-colonial stone church belfry and majestic Philippine mountains under a luminous sunrise. --ar 8.5:11 --v 6.0</w:t>
             </w:r>
           </w:p>
         </w:tc>
@@ -316,864 +271,6 @@
         <w:spacing w:after="40"/>
       </w:pPr>
     </w:p>
-    <w:p>
-      <w:r>
-        <w:br w:type="page"/>
-      </w:r>
-    </w:p>
-    <w:tbl>
-      <w:tblPr>
-        <w:tblW w:type="auto" w:w="0"/>
-        <w:jc w:val="center"/>
-        <w:tblLook w:firstColumn="1" w:firstRow="1" w:lastColumn="0" w:lastRow="0" w:noHBand="0" w:noVBand="1" w:val="04A0"/>
-      </w:tblPr>
-      <w:tblGrid>
-        <w:gridCol w:w="9936"/>
-      </w:tblGrid>
-      <w:tr>
-        <w:tc>
-          <w:tcPr>
-            <w:tcW w:type="dxa" w:w="9936"/>
-            <w:shd w:fill="1B365D"/>
-            <w:tcMar>
-              <w:top w:w="140" w:type="dxa"/>
-              <w:bottom w:w="140" w:type="dxa"/>
-              <w:left w:w="180" w:type="dxa"/>
-              <w:right w:w="180" w:type="dxa"/>
-            </w:tcMar>
-          </w:tcPr>
-          <w:p>
-            <w:pPr>
-              <w:spacing w:before="40" w:after="40" w:line="276" w:lineRule="auto"/>
-              <w:jc w:val="center"/>
-            </w:pPr>
-            <w:r>
-              <w:rPr>
-                <w:rFonts w:ascii="Arial" w:hAnsi="Arial"/>
-                <w:b/>
-                <w:color w:val="FFFFFF"/>
-                <w:sz w:val="24"/>
-              </w:rPr>
-              <w:t>TALAAN NG NILALAMAN AT BALANGKAS NG PAGKATUTO</w:t>
-            </w:r>
-          </w:p>
-        </w:tc>
-      </w:tr>
-    </w:tbl>
-    <w:tbl>
-      <w:tblPr>
-        <w:tblW w:type="auto" w:w="0"/>
-        <w:jc w:val="center"/>
-        <w:tblLook w:firstColumn="1" w:firstRow="1" w:lastColumn="0" w:lastRow="0" w:noHBand="0" w:noVBand="1" w:val="04A0"/>
-      </w:tblPr>
-      <w:tblGrid>
-        <w:gridCol w:w="9936"/>
-      </w:tblGrid>
-      <w:tr>
-        <w:tc>
-          <w:tcPr>
-            <w:tcW w:type="dxa" w:w="9936"/>
-            <w:shd w:fill="FAFAFA"/>
-            <w:tcBorders>
-              <w:top w:val="none"/>
-              <w:left w:val="single" w:sz="36" w:space="0" w:color="1B365D"/>
-              <w:bottom w:val="none"/>
-              <w:right w:val="none"/>
-            </w:tcBorders>
-            <w:tcMar>
-              <w:top w:w="100" w:type="dxa"/>
-              <w:bottom w:w="100" w:type="dxa"/>
-              <w:left w:w="160" w:type="dxa"/>
-              <w:right w:w="160" w:type="dxa"/>
-            </w:tcMar>
-          </w:tcPr>
-          <w:p>
-            <w:pPr>
-              <w:spacing w:before="20" w:after="40" w:line="276" w:lineRule="auto"/>
-              <w:jc w:val="left"/>
-            </w:pPr>
-            <w:r>
-              <w:rPr>
-                <w:rFonts w:ascii="Cambria" w:hAnsi="Cambria"/>
-                <w:b/>
-                <w:color w:val="1B365D"/>
-                <w:sz w:val="21"/>
-              </w:rPr>
-              <w:t>YUNIT III: AKO AT ANG AKING PAGKATAO, TANGLAW NG KATATAGAN</w:t>
-            </w:r>
-          </w:p>
-          <w:p>
-            <w:pPr>
-              <w:spacing w:before="0" w:after="20" w:line="252" w:lineRule="auto"/>
-              <w:jc w:val="left"/>
-            </w:pPr>
-            <w:r>
-              <w:rPr>
-                <w:rFonts w:ascii="Cambria" w:hAnsi="Cambria"/>
-                <w:b/>
-                <w:color w:val="1B365D"/>
-                <w:sz w:val="18"/>
-              </w:rPr>
-              <w:t>ARALIN 13: Ang Panitikan sa Panahong Sakop ng Espanya ang Pilipinas</w:t>
-            </w:r>
-            <w:r>
-              <w:rPr>
-                <w:rFonts w:ascii="Cambria" w:hAnsi="Cambria"/>
-                <w:color w:val="888888"/>
-                <w:sz w:val="16"/>
-              </w:rPr>
-              <w:t xml:space="preserve"> .. </w:t>
-            </w:r>
-            <w:r>
-              <w:rPr>
-                <w:rFonts w:ascii="Cambria" w:hAnsi="Cambria"/>
-                <w:b/>
-                <w:color w:val="1B365D"/>
-                <w:sz w:val="18"/>
-              </w:rPr>
-              <w:t>4</w:t>
-            </w:r>
-          </w:p>
-          <w:p>
-            <w:pPr>
-              <w:spacing w:before="0" w:after="20" w:line="252" w:lineRule="auto"/>
-              <w:jc w:val="left"/>
-            </w:pPr>
-            <w:r>
-              <w:rPr>
-                <w:rFonts w:ascii="Cambria" w:hAnsi="Cambria"/>
-                <w:color w:val="333333"/>
-                <w:sz w:val="17"/>
-              </w:rPr>
-              <w:t xml:space="preserve">  • Lunsaran: Kaligirang Pangkasaysayan at Tekstong Paglalahad</w:t>
-            </w:r>
-          </w:p>
-          <w:p>
-            <w:pPr>
-              <w:spacing w:before="0" w:after="20" w:line="252" w:lineRule="auto"/>
-              <w:jc w:val="left"/>
-            </w:pPr>
-            <w:r>
-              <w:rPr>
-                <w:rFonts w:ascii="Cambria" w:hAnsi="Cambria"/>
-                <w:color w:val="333333"/>
-                <w:sz w:val="17"/>
-              </w:rPr>
-              <w:t xml:space="preserve">  • Paksa 13.1: Panitikan at Kaligirang Pangkasaysayan sa Panahon ng Espanyol</w:t>
-            </w:r>
-            <w:r>
-              <w:rPr>
-                <w:rFonts w:ascii="Cambria" w:hAnsi="Cambria"/>
-                <w:color w:val="888888"/>
-                <w:sz w:val="16"/>
-              </w:rPr>
-              <w:t xml:space="preserve"> .. </w:t>
-            </w:r>
-            <w:r>
-              <w:rPr>
-                <w:rFonts w:ascii="Cambria" w:hAnsi="Cambria"/>
-                <w:b/>
-                <w:color w:val="1B365D"/>
-                <w:sz w:val="17"/>
-              </w:rPr>
-              <w:t>5</w:t>
-            </w:r>
-          </w:p>
-          <w:p>
-            <w:pPr>
-              <w:spacing w:before="0" w:after="20" w:line="252" w:lineRule="auto"/>
-              <w:jc w:val="left"/>
-            </w:pPr>
-            <w:r>
-              <w:rPr>
-                <w:rFonts w:ascii="Cambria" w:hAnsi="Cambria"/>
-                <w:color w:val="333333"/>
-                <w:sz w:val="17"/>
-              </w:rPr>
-              <w:t xml:space="preserve">  • Paksa 13.2: Nailathalang Balita at Panghihiram o Pagtutumbas ng Salita</w:t>
-            </w:r>
-            <w:r>
-              <w:rPr>
-                <w:rFonts w:ascii="Cambria" w:hAnsi="Cambria"/>
-                <w:color w:val="888888"/>
-                <w:sz w:val="16"/>
-              </w:rPr>
-              <w:t xml:space="preserve"> .. </w:t>
-            </w:r>
-            <w:r>
-              <w:rPr>
-                <w:rFonts w:ascii="Cambria" w:hAnsi="Cambria"/>
-                <w:b/>
-                <w:color w:val="1B365D"/>
-                <w:sz w:val="17"/>
-              </w:rPr>
-              <w:t>6</w:t>
-            </w:r>
-          </w:p>
-          <w:p>
-            <w:pPr>
-              <w:spacing w:before="0" w:after="20" w:line="252" w:lineRule="auto"/>
-              <w:jc w:val="left"/>
-            </w:pPr>
-            <w:r>
-              <w:rPr>
-                <w:rFonts w:ascii="Cambria" w:hAnsi="Cambria"/>
-                <w:color w:val="333333"/>
-                <w:sz w:val="17"/>
-              </w:rPr>
-              <w:t xml:space="preserve">  • Paksa 13.3: Etnisidad, Tekstong Biswal, at Gawaing Multimodal</w:t>
-            </w:r>
-            <w:r>
-              <w:rPr>
-                <w:rFonts w:ascii="Cambria" w:hAnsi="Cambria"/>
-                <w:color w:val="888888"/>
-                <w:sz w:val="16"/>
-              </w:rPr>
-              <w:t xml:space="preserve"> .. </w:t>
-            </w:r>
-            <w:r>
-              <w:rPr>
-                <w:rFonts w:ascii="Cambria" w:hAnsi="Cambria"/>
-                <w:b/>
-                <w:color w:val="1B365D"/>
-                <w:sz w:val="17"/>
-              </w:rPr>
-              <w:t>9</w:t>
-            </w:r>
-          </w:p>
-          <w:p>
-            <w:pPr>
-              <w:spacing w:before="0" w:after="20" w:line="252" w:lineRule="auto"/>
-              <w:jc w:val="left"/>
-            </w:pPr>
-            <w:r>
-              <w:rPr>
-                <w:rFonts w:ascii="Cambria" w:hAnsi="Cambria"/>
-                <w:color w:val="333333"/>
-                <w:sz w:val="17"/>
-              </w:rPr>
-              <w:t xml:space="preserve">  • Mga Gawaing Pampagkatuto 13.1–13.3 at Mabilisang Pagtataya (15 Puntos)</w:t>
-            </w:r>
-            <w:r>
-              <w:rPr>
-                <w:rFonts w:ascii="Cambria" w:hAnsi="Cambria"/>
-                <w:color w:val="888888"/>
-                <w:sz w:val="16"/>
-              </w:rPr>
-              <w:t xml:space="preserve"> .. </w:t>
-            </w:r>
-            <w:r>
-              <w:rPr>
-                <w:rFonts w:ascii="Cambria" w:hAnsi="Cambria"/>
-                <w:b/>
-                <w:color w:val="1B365D"/>
-                <w:sz w:val="17"/>
-              </w:rPr>
-              <w:t>10</w:t>
-            </w:r>
-          </w:p>
-          <w:p>
-            <w:pPr>
-              <w:spacing w:before="0" w:after="20" w:line="252" w:lineRule="auto"/>
-              <w:jc w:val="left"/>
-            </w:pPr>
-            <w:r>
-              <w:rPr>
-                <w:rFonts w:ascii="Cambria" w:hAnsi="Cambria"/>
-                <w:color w:val="333333"/>
-                <w:sz w:val="17"/>
-              </w:rPr>
-              <w:t xml:space="preserve">  • Alokasyon ng Oras: 5 Sesyon (Sesyon 1 hanggang 5)</w:t>
-            </w:r>
-            <w:r>
-              <w:rPr>
-                <w:rFonts w:ascii="Cambria" w:hAnsi="Cambria"/>
-                <w:color w:val="888888"/>
-                <w:sz w:val="16"/>
-              </w:rPr>
-              <w:t xml:space="preserve"> ....... </w:t>
-            </w:r>
-            <w:r>
-              <w:rPr>
-                <w:rFonts w:ascii="Cambria" w:hAnsi="Cambria"/>
-                <w:b/>
-                <w:color w:val="1B365D"/>
-                <w:sz w:val="17"/>
-              </w:rPr>
-              <w:t>15</w:t>
-            </w:r>
-          </w:p>
-          <w:p>
-            <w:pPr>
-              <w:spacing w:before="0" w:after="20" w:line="252" w:lineRule="auto"/>
-              <w:jc w:val="left"/>
-            </w:pPr>
-            <w:r>
-              <w:rPr>
-                <w:rFonts w:ascii="Cambria" w:hAnsi="Cambria"/>
-                <w:color w:val="333333"/>
-                <w:sz w:val="17"/>
-              </w:rPr>
-            </w:r>
-          </w:p>
-          <w:p>
-            <w:pPr>
-              <w:spacing w:before="0" w:after="20" w:line="252" w:lineRule="auto"/>
-              <w:jc w:val="left"/>
-            </w:pPr>
-            <w:r>
-              <w:rPr>
-                <w:rFonts w:ascii="Cambria" w:hAnsi="Cambria"/>
-                <w:b/>
-                <w:color w:val="1B365D"/>
-                <w:sz w:val="18"/>
-              </w:rPr>
-              <w:t>ARALIN 14: Pasyon at mga Tekstong Panrelihiyon sa Panahong Kolonyal</w:t>
-            </w:r>
-            <w:r>
-              <w:rPr>
-                <w:rFonts w:ascii="Cambria" w:hAnsi="Cambria"/>
-                <w:color w:val="888888"/>
-                <w:sz w:val="16"/>
-              </w:rPr>
-              <w:t xml:space="preserve"> .. </w:t>
-            </w:r>
-            <w:r>
-              <w:rPr>
-                <w:rFonts w:ascii="Cambria" w:hAnsi="Cambria"/>
-                <w:b/>
-                <w:color w:val="1B365D"/>
-                <w:sz w:val="18"/>
-              </w:rPr>
-              <w:t>16</w:t>
-            </w:r>
-          </w:p>
-          <w:p>
-            <w:pPr>
-              <w:spacing w:before="0" w:after="20" w:line="252" w:lineRule="auto"/>
-              <w:jc w:val="left"/>
-            </w:pPr>
-            <w:r>
-              <w:rPr>
-                <w:rFonts w:ascii="Cambria" w:hAnsi="Cambria"/>
-                <w:color w:val="333333"/>
-                <w:sz w:val="17"/>
-              </w:rPr>
-              <w:t xml:space="preserve">  • Lunsaran: Ang Pasyon bilang Panitikan at Kulturang Pasalaysay</w:t>
-            </w:r>
-          </w:p>
-          <w:p>
-            <w:pPr>
-              <w:spacing w:before="0" w:after="20" w:line="252" w:lineRule="auto"/>
-              <w:jc w:val="left"/>
-            </w:pPr>
-            <w:r>
-              <w:rPr>
-                <w:rFonts w:ascii="Cambria" w:hAnsi="Cambria"/>
-                <w:color w:val="333333"/>
-                <w:sz w:val="17"/>
-              </w:rPr>
-              <w:t xml:space="preserve">  • Paksa 14.1: Akdang Panrelihiyon—Anyo, Mensahe, Konteksto, at Tradisyon</w:t>
-            </w:r>
-            <w:r>
-              <w:rPr>
-                <w:rFonts w:ascii="Cambria" w:hAnsi="Cambria"/>
-                <w:color w:val="888888"/>
-                <w:sz w:val="16"/>
-              </w:rPr>
-              <w:t xml:space="preserve"> .. </w:t>
-            </w:r>
-            <w:r>
-              <w:rPr>
-                <w:rFonts w:ascii="Cambria" w:hAnsi="Cambria"/>
-                <w:b/>
-                <w:color w:val="1B365D"/>
-                <w:sz w:val="17"/>
-              </w:rPr>
-              <w:t>17</w:t>
-            </w:r>
-          </w:p>
-          <w:p>
-            <w:pPr>
-              <w:spacing w:before="0" w:after="20" w:line="252" w:lineRule="auto"/>
-              <w:jc w:val="left"/>
-            </w:pPr>
-            <w:r>
-              <w:rPr>
-                <w:rFonts w:ascii="Cambria" w:hAnsi="Cambria"/>
-                <w:color w:val="333333"/>
-                <w:sz w:val="17"/>
-              </w:rPr>
-              <w:t xml:space="preserve">  • Paksa 14.2: Mga Pahayagan at Wikang Nasusulat noong Panahon ng Espanyol</w:t>
-            </w:r>
-            <w:r>
-              <w:rPr>
-                <w:rFonts w:ascii="Cambria" w:hAnsi="Cambria"/>
-                <w:color w:val="888888"/>
-                <w:sz w:val="16"/>
-              </w:rPr>
-              <w:t xml:space="preserve"> .. </w:t>
-            </w:r>
-            <w:r>
-              <w:rPr>
-                <w:rFonts w:ascii="Cambria" w:hAnsi="Cambria"/>
-                <w:b/>
-                <w:color w:val="1B365D"/>
-                <w:sz w:val="17"/>
-              </w:rPr>
-              <w:t>18</w:t>
-            </w:r>
-          </w:p>
-          <w:p>
-            <w:pPr>
-              <w:spacing w:before="0" w:after="20" w:line="252" w:lineRule="auto"/>
-              <w:jc w:val="left"/>
-            </w:pPr>
-            <w:r>
-              <w:rPr>
-                <w:rFonts w:ascii="Cambria" w:hAnsi="Cambria"/>
-                <w:color w:val="333333"/>
-                <w:sz w:val="17"/>
-              </w:rPr>
-              <w:t xml:space="preserve">  • Paksa 14.3: Antas ng Pamumuhay at Elementong Biswal ng Comic Book Brochure</w:t>
-            </w:r>
-            <w:r>
-              <w:rPr>
-                <w:rFonts w:ascii="Cambria" w:hAnsi="Cambria"/>
-                <w:color w:val="888888"/>
-                <w:sz w:val="16"/>
-              </w:rPr>
-              <w:t xml:space="preserve"> .. </w:t>
-            </w:r>
-            <w:r>
-              <w:rPr>
-                <w:rFonts w:ascii="Cambria" w:hAnsi="Cambria"/>
-                <w:b/>
-                <w:color w:val="1B365D"/>
-                <w:sz w:val="17"/>
-              </w:rPr>
-              <w:t>21</w:t>
-            </w:r>
-          </w:p>
-          <w:p>
-            <w:pPr>
-              <w:spacing w:before="0" w:after="20" w:line="252" w:lineRule="auto"/>
-              <w:jc w:val="left"/>
-            </w:pPr>
-            <w:r>
-              <w:rPr>
-                <w:rFonts w:ascii="Cambria" w:hAnsi="Cambria"/>
-                <w:color w:val="333333"/>
-                <w:sz w:val="17"/>
-              </w:rPr>
-              <w:t xml:space="preserve">  • Mga Gawaing Pampagkatuto 14.1–14.3 at Mabilisang Pagtataya (15 Puntos)</w:t>
-            </w:r>
-            <w:r>
-              <w:rPr>
-                <w:rFonts w:ascii="Cambria" w:hAnsi="Cambria"/>
-                <w:color w:val="888888"/>
-                <w:sz w:val="16"/>
-              </w:rPr>
-              <w:t xml:space="preserve"> .. </w:t>
-            </w:r>
-            <w:r>
-              <w:rPr>
-                <w:rFonts w:ascii="Cambria" w:hAnsi="Cambria"/>
-                <w:b/>
-                <w:color w:val="1B365D"/>
-                <w:sz w:val="17"/>
-              </w:rPr>
-              <w:t>22</w:t>
-            </w:r>
-          </w:p>
-          <w:p>
-            <w:pPr>
-              <w:spacing w:before="0" w:after="20" w:line="252" w:lineRule="auto"/>
-              <w:jc w:val="left"/>
-            </w:pPr>
-            <w:r>
-              <w:rPr>
-                <w:rFonts w:ascii="Cambria" w:hAnsi="Cambria"/>
-                <w:color w:val="333333"/>
-                <w:sz w:val="17"/>
-              </w:rPr>
-              <w:t xml:space="preserve">  • Alokasyon ng Oras: 5 Sesyon (Sesyon 6 hanggang 10)</w:t>
-            </w:r>
-            <w:r>
-              <w:rPr>
-                <w:rFonts w:ascii="Cambria" w:hAnsi="Cambria"/>
-                <w:color w:val="888888"/>
-                <w:sz w:val="16"/>
-              </w:rPr>
-              <w:t xml:space="preserve"> ...... </w:t>
-            </w:r>
-            <w:r>
-              <w:rPr>
-                <w:rFonts w:ascii="Cambria" w:hAnsi="Cambria"/>
-                <w:b/>
-                <w:color w:val="1B365D"/>
-                <w:sz w:val="17"/>
-              </w:rPr>
-              <w:t>27</w:t>
-            </w:r>
-          </w:p>
-          <w:p>
-            <w:pPr>
-              <w:spacing w:before="0" w:after="20" w:line="252" w:lineRule="auto"/>
-              <w:jc w:val="left"/>
-            </w:pPr>
-            <w:r>
-              <w:rPr>
-                <w:rFonts w:ascii="Cambria" w:hAnsi="Cambria"/>
-                <w:color w:val="333333"/>
-                <w:sz w:val="17"/>
-              </w:rPr>
-            </w:r>
-          </w:p>
-          <w:p>
-            <w:pPr>
-              <w:spacing w:before="0" w:after="20" w:line="252" w:lineRule="auto"/>
-              <w:jc w:val="left"/>
-            </w:pPr>
-            <w:r>
-              <w:rPr>
-                <w:rFonts w:ascii="Cambria" w:hAnsi="Cambria"/>
-                <w:b/>
-                <w:color w:val="1B365D"/>
-                <w:sz w:val="18"/>
-              </w:rPr>
-              <w:t>ARALIN 15: Ang Liham ni Urbana kay Feliza tungkol sa Kalinisan</w:t>
-            </w:r>
-            <w:r>
-              <w:rPr>
-                <w:rFonts w:ascii="Cambria" w:hAnsi="Cambria"/>
-                <w:color w:val="888888"/>
-                <w:sz w:val="16"/>
-              </w:rPr>
-              <w:t xml:space="preserve"> .. </w:t>
-            </w:r>
-            <w:r>
-              <w:rPr>
-                <w:rFonts w:ascii="Cambria" w:hAnsi="Cambria"/>
-                <w:b/>
-                <w:color w:val="1B365D"/>
-                <w:sz w:val="18"/>
-              </w:rPr>
-              <w:t>28</w:t>
-            </w:r>
-          </w:p>
-          <w:p>
-            <w:pPr>
-              <w:spacing w:before="0" w:after="20" w:line="252" w:lineRule="auto"/>
-              <w:jc w:val="left"/>
-            </w:pPr>
-            <w:r>
-              <w:rPr>
-                <w:rFonts w:ascii="Cambria" w:hAnsi="Cambria"/>
-                <w:color w:val="333333"/>
-                <w:sz w:val="17"/>
-              </w:rPr>
-              <w:t xml:space="preserve">  • Lunsaran: Akdang Pangkagandahang-asal at Wikang Didaktiko</w:t>
-            </w:r>
-          </w:p>
-          <w:p>
-            <w:pPr>
-              <w:spacing w:before="0" w:after="20" w:line="252" w:lineRule="auto"/>
-              <w:jc w:val="left"/>
-            </w:pPr>
-            <w:r>
-              <w:rPr>
-                <w:rFonts w:ascii="Cambria" w:hAnsi="Cambria"/>
-                <w:color w:val="333333"/>
-                <w:sz w:val="17"/>
-              </w:rPr>
-              <w:t xml:space="preserve">  • Paksa 15.1: Mensahe, Pagpapahalaga, at Konteksto ng Akdang Pangkagandahang-asal</w:t>
-            </w:r>
-            <w:r>
-              <w:rPr>
-                <w:rFonts w:ascii="Cambria" w:hAnsi="Cambria"/>
-                <w:color w:val="888888"/>
-                <w:sz w:val="16"/>
-              </w:rPr>
-              <w:t xml:space="preserve"> .. </w:t>
-            </w:r>
-            <w:r>
-              <w:rPr>
-                <w:rFonts w:ascii="Cambria" w:hAnsi="Cambria"/>
-                <w:b/>
-                <w:color w:val="1B365D"/>
-                <w:sz w:val="17"/>
-              </w:rPr>
-              <w:t>29</w:t>
-            </w:r>
-          </w:p>
-          <w:p>
-            <w:pPr>
-              <w:spacing w:before="0" w:after="20" w:line="252" w:lineRule="auto"/>
-              <w:jc w:val="left"/>
-            </w:pPr>
-            <w:r>
-              <w:rPr>
-                <w:rFonts w:ascii="Cambria" w:hAnsi="Cambria"/>
-                <w:color w:val="333333"/>
-                <w:sz w:val="17"/>
-              </w:rPr>
-              <w:t xml:space="preserve">  • Paksa 15.2: Pagkuha ng Impormasyon para sa Balita at Wikang Gamit sa Panayam</w:t>
-            </w:r>
-            <w:r>
-              <w:rPr>
-                <w:rFonts w:ascii="Cambria" w:hAnsi="Cambria"/>
-                <w:color w:val="888888"/>
-                <w:sz w:val="16"/>
-              </w:rPr>
-              <w:t xml:space="preserve"> .. </w:t>
-            </w:r>
-            <w:r>
-              <w:rPr>
-                <w:rFonts w:ascii="Cambria" w:hAnsi="Cambria"/>
-                <w:b/>
-                <w:color w:val="1B365D"/>
-                <w:sz w:val="17"/>
-              </w:rPr>
-              <w:t>30</w:t>
-            </w:r>
-          </w:p>
-          <w:p>
-            <w:pPr>
-              <w:spacing w:before="0" w:after="20" w:line="252" w:lineRule="auto"/>
-              <w:jc w:val="left"/>
-            </w:pPr>
-            <w:r>
-              <w:rPr>
-                <w:rFonts w:ascii="Cambria" w:hAnsi="Cambria"/>
-                <w:color w:val="333333"/>
-                <w:sz w:val="17"/>
-              </w:rPr>
-              <w:t xml:space="preserve">  • Paksa 15.3: Kababaihan sa Panahon ng Espanyol at Pagwawasto ng Diyalogo</w:t>
-            </w:r>
-            <w:r>
-              <w:rPr>
-                <w:rFonts w:ascii="Cambria" w:hAnsi="Cambria"/>
-                <w:color w:val="888888"/>
-                <w:sz w:val="16"/>
-              </w:rPr>
-              <w:t xml:space="preserve"> .. </w:t>
-            </w:r>
-            <w:r>
-              <w:rPr>
-                <w:rFonts w:ascii="Cambria" w:hAnsi="Cambria"/>
-                <w:b/>
-                <w:color w:val="1B365D"/>
-                <w:sz w:val="17"/>
-              </w:rPr>
-              <w:t>33</w:t>
-            </w:r>
-          </w:p>
-          <w:p>
-            <w:pPr>
-              <w:spacing w:before="0" w:after="20" w:line="252" w:lineRule="auto"/>
-              <w:jc w:val="left"/>
-            </w:pPr>
-            <w:r>
-              <w:rPr>
-                <w:rFonts w:ascii="Cambria" w:hAnsi="Cambria"/>
-                <w:color w:val="333333"/>
-                <w:sz w:val="17"/>
-              </w:rPr>
-              <w:t xml:space="preserve">  • Mga Gawaing Pampagkatuto 15.1–15.3 at Mabilisang Pagtataya (15 Puntos)</w:t>
-            </w:r>
-            <w:r>
-              <w:rPr>
-                <w:rFonts w:ascii="Cambria" w:hAnsi="Cambria"/>
-                <w:color w:val="888888"/>
-                <w:sz w:val="16"/>
-              </w:rPr>
-              <w:t xml:space="preserve"> .. </w:t>
-            </w:r>
-            <w:r>
-              <w:rPr>
-                <w:rFonts w:ascii="Cambria" w:hAnsi="Cambria"/>
-                <w:b/>
-                <w:color w:val="1B365D"/>
-                <w:sz w:val="17"/>
-              </w:rPr>
-              <w:t>34</w:t>
-            </w:r>
-          </w:p>
-          <w:p>
-            <w:pPr>
-              <w:spacing w:before="0" w:after="20" w:line="252" w:lineRule="auto"/>
-              <w:jc w:val="left"/>
-            </w:pPr>
-            <w:r>
-              <w:rPr>
-                <w:rFonts w:ascii="Cambria" w:hAnsi="Cambria"/>
-                <w:color w:val="333333"/>
-                <w:sz w:val="17"/>
-              </w:rPr>
-              <w:t xml:space="preserve">  • Alokasyon ng Oras: 5 Sesyon (Sesyon 11 hanggang 15)</w:t>
-            </w:r>
-            <w:r>
-              <w:rPr>
-                <w:rFonts w:ascii="Cambria" w:hAnsi="Cambria"/>
-                <w:color w:val="888888"/>
-                <w:sz w:val="16"/>
-              </w:rPr>
-              <w:t xml:space="preserve"> ..... </w:t>
-            </w:r>
-            <w:r>
-              <w:rPr>
-                <w:rFonts w:ascii="Cambria" w:hAnsi="Cambria"/>
-                <w:b/>
-                <w:color w:val="1B365D"/>
-                <w:sz w:val="17"/>
-              </w:rPr>
-              <w:t>39</w:t>
-            </w:r>
-          </w:p>
-          <w:p>
-            <w:pPr>
-              <w:spacing w:before="0" w:after="20" w:line="252" w:lineRule="auto"/>
-              <w:jc w:val="left"/>
-            </w:pPr>
-            <w:r>
-              <w:rPr>
-                <w:rFonts w:ascii="Cambria" w:hAnsi="Cambria"/>
-                <w:color w:val="333333"/>
-                <w:sz w:val="17"/>
-              </w:rPr>
-            </w:r>
-          </w:p>
-          <w:p>
-            <w:pPr>
-              <w:spacing w:before="0" w:after="20" w:line="252" w:lineRule="auto"/>
-              <w:jc w:val="left"/>
-            </w:pPr>
-            <w:r>
-              <w:rPr>
-                <w:rFonts w:ascii="Cambria" w:hAnsi="Cambria"/>
-                <w:b/>
-                <w:color w:val="1B365D"/>
-                <w:sz w:val="18"/>
-              </w:rPr>
-              <w:t>PANGWAKAS NA PAGTATAYA SA YUNIT III (KABUUANG 40 PUNTOS)</w:t>
-            </w:r>
-            <w:r>
-              <w:rPr>
-                <w:rFonts w:ascii="Cambria" w:hAnsi="Cambria"/>
-                <w:color w:val="888888"/>
-                <w:sz w:val="16"/>
-              </w:rPr>
-              <w:t xml:space="preserve"> .... </w:t>
-            </w:r>
-            <w:r>
-              <w:rPr>
-                <w:rFonts w:ascii="Cambria" w:hAnsi="Cambria"/>
-                <w:b/>
-                <w:color w:val="1B365D"/>
-                <w:sz w:val="18"/>
-              </w:rPr>
-              <w:t>40</w:t>
-            </w:r>
-          </w:p>
-          <w:p>
-            <w:pPr>
-              <w:spacing w:before="0" w:after="20" w:line="252" w:lineRule="auto"/>
-              <w:jc w:val="left"/>
-            </w:pPr>
-            <w:r>
-              <w:rPr>
-                <w:rFonts w:ascii="Cambria" w:hAnsi="Cambria"/>
-                <w:color w:val="333333"/>
-                <w:sz w:val="17"/>
-              </w:rPr>
-              <w:t xml:space="preserve">  • Bahagi I–IV: Pagsusuri ng Batis, Konsepto, Sanaysay, at GRASPS Comic Brochure</w:t>
-            </w:r>
-            <w:r>
-              <w:rPr>
-                <w:rFonts w:ascii="Cambria" w:hAnsi="Cambria"/>
-                <w:color w:val="888888"/>
-                <w:sz w:val="16"/>
-              </w:rPr>
-              <w:t xml:space="preserve"> .. </w:t>
-            </w:r>
-            <w:r>
-              <w:rPr>
-                <w:rFonts w:ascii="Cambria" w:hAnsi="Cambria"/>
-                <w:b/>
-                <w:color w:val="1B365D"/>
-                <w:sz w:val="17"/>
-              </w:rPr>
-              <w:t>40</w:t>
-            </w:r>
-          </w:p>
-          <w:p>
-            <w:pPr>
-              <w:spacing w:before="0" w:after="20" w:line="252" w:lineRule="auto"/>
-              <w:jc w:val="left"/>
-            </w:pPr>
-            <w:r>
-              <w:rPr>
-                <w:rFonts w:ascii="Cambria" w:hAnsi="Cambria"/>
-                <w:b/>
-                <w:color w:val="1B365D"/>
-                <w:sz w:val="18"/>
-              </w:rPr>
-              <w:t>BUOD NG YUNIT III AT KOMPREHENSIBONG TALATINIGAN (25 KONSEPTO)</w:t>
-            </w:r>
-            <w:r>
-              <w:rPr>
-                <w:rFonts w:ascii="Cambria" w:hAnsi="Cambria"/>
-                <w:color w:val="888888"/>
-                <w:sz w:val="16"/>
-              </w:rPr>
-              <w:t xml:space="preserve"> .. </w:t>
-            </w:r>
-            <w:r>
-              <w:rPr>
-                <w:rFonts w:ascii="Cambria" w:hAnsi="Cambria"/>
-                <w:b/>
-                <w:color w:val="1B365D"/>
-                <w:sz w:val="18"/>
-              </w:rPr>
-              <w:t>43</w:t>
-            </w:r>
-          </w:p>
-          <w:p>
-            <w:pPr>
-              <w:spacing w:before="0" w:after="20" w:line="252" w:lineRule="auto"/>
-              <w:jc w:val="left"/>
-            </w:pPr>
-            <w:r>
-              <w:rPr>
-                <w:rFonts w:ascii="Cambria" w:hAnsi="Cambria"/>
-                <w:b/>
-                <w:color w:val="1B365D"/>
-                <w:sz w:val="18"/>
-              </w:rPr>
-              <w:t>KOMPLETONG SUSI SA PAGWAWASTO, RASYONAL, AT GABAY SA GURO</w:t>
-            </w:r>
-            <w:r>
-              <w:rPr>
-                <w:rFonts w:ascii="Cambria" w:hAnsi="Cambria"/>
-                <w:color w:val="888888"/>
-                <w:sz w:val="16"/>
-              </w:rPr>
-              <w:t xml:space="preserve"> ... </w:t>
-            </w:r>
-            <w:r>
-              <w:rPr>
-                <w:rFonts w:ascii="Cambria" w:hAnsi="Cambria"/>
-                <w:b/>
-                <w:color w:val="1B365D"/>
-                <w:sz w:val="18"/>
-              </w:rPr>
-              <w:t>44</w:t>
-            </w:r>
-          </w:p>
-        </w:tc>
-      </w:tr>
-    </w:tbl>
     <w:p>
       <w:r>
         <w:br w:type="page"/>
@@ -1197,6 +294,10 @@
         <w:gridCol w:w="9936"/>
       </w:tblGrid>
       <w:tr>
+        <w:trPr>
+          <w:cantSplit/>
+          <w:tblHeader/>
+        </w:trPr>
         <w:tc>
           <w:tcPr>
             <w:tcW w:type="dxa" w:w="9936"/>
@@ -1220,7 +321,7 @@
                 <w:color w:val="FFFFFF"/>
                 <w:sz w:val="27"/>
               </w:rPr>
-              <w:t>ARALIN 13: Ang Panitikan sa Panahong Sakop ng Espanya ang Pilipinas</w:t>
+              <w:t>TALAAN NG NILALAMAN AT BALANGKAS NG PAGKATUTO</w:t>
             </w:r>
           </w:p>
         </w:tc>
@@ -1241,6 +342,463 @@
         <w:gridCol w:w="9936"/>
       </w:tblGrid>
       <w:tr>
+        <w:trPr>
+          <w:cantSplit/>
+          <w:tblHeader/>
+        </w:trPr>
+        <w:tc>
+          <w:tcPr>
+            <w:tcW w:type="dxa" w:w="9936"/>
+            <w:shd w:fill="F4F7FA"/>
+            <w:tcBorders>
+              <w:top w:val="none"/>
+              <w:left w:val="single" w:sz="36" w:space="0" w:color="1B365D"/>
+              <w:bottom w:val="none"/>
+              <w:right w:val="none"/>
+            </w:tcBorders>
+            <w:tcMar>
+              <w:top w:w="140" w:type="dxa"/>
+              <w:bottom w:w="140" w:type="dxa"/>
+              <w:left w:w="180" w:type="dxa"/>
+              <w:right w:w="180" w:type="dxa"/>
+            </w:tcMar>
+          </w:tcPr>
+          <w:p>
+            <w:pPr>
+              <w:spacing w:before="0" w:after="40" w:line="276" w:lineRule="auto"/>
+              <w:jc w:val="left"/>
+            </w:pPr>
+            <w:r>
+              <w:rPr>
+                <w:rFonts w:ascii="Arial" w:hAnsi="Arial"/>
+                <w:b/>
+                <w:color w:val="1B365D"/>
+                <w:sz w:val="21"/>
+              </w:rPr>
+              <w:t>PANGKALAHATANG BALANGKAS NG YUNIT III</w:t>
+            </w:r>
+          </w:p>
+          <w:p>
+            <w:pPr>
+              <w:spacing w:before="0" w:after="40" w:line="276" w:lineRule="auto"/>
+              <w:jc w:val="left"/>
+            </w:pPr>
+            <w:r>
+              <w:rPr>
+                <w:rFonts w:ascii="Cambria" w:hAnsi="Cambria"/>
+                <w:sz w:val="20"/>
+              </w:rPr>
+              <w:t>YUNIT III: AKO AT ANG AKING PAGKATAO, TANGLAW NG KATATAGAN</w:t>
+            </w:r>
+          </w:p>
+          <w:p>
+            <w:pPr>
+              <w:spacing w:before="0" w:after="40" w:line="276" w:lineRule="auto"/>
+              <w:jc w:val="left"/>
+            </w:pPr>
+            <w:r>
+              <w:rPr>
+                <w:rFonts w:ascii="Cambria" w:hAnsi="Cambria"/>
+                <w:sz w:val="20"/>
+              </w:rPr>
+              <w:t>ARALIN 13: Ang Panitikan sa Panahong Sakop ng Espanya ang Pilipinas .................. 4</w:t>
+            </w:r>
+          </w:p>
+          <w:p>
+            <w:pPr>
+              <w:spacing w:before="0" w:after="40" w:line="276" w:lineRule="auto"/>
+              <w:jc w:val="left"/>
+            </w:pPr>
+            <w:r>
+              <w:rPr>
+                <w:rFonts w:ascii="Cambria" w:hAnsi="Cambria"/>
+                <w:sz w:val="20"/>
+              </w:rPr>
+              <w:t xml:space="preserve">  • Lunsaran: Kaligirang Pangkasaysayan at Tekstong Paglalahad</w:t>
+            </w:r>
+          </w:p>
+          <w:p>
+            <w:pPr>
+              <w:spacing w:before="0" w:after="40" w:line="276" w:lineRule="auto"/>
+              <w:jc w:val="left"/>
+            </w:pPr>
+            <w:r>
+              <w:rPr>
+                <w:rFonts w:ascii="Cambria" w:hAnsi="Cambria"/>
+                <w:sz w:val="20"/>
+              </w:rPr>
+              <w:t xml:space="preserve">  • Paksa 13.1: Panitikan at Kaligirang Pangkasaysayan sa Panahon ng Espanyol ........ 5</w:t>
+            </w:r>
+          </w:p>
+          <w:p>
+            <w:pPr>
+              <w:spacing w:before="0" w:after="40" w:line="276" w:lineRule="auto"/>
+              <w:jc w:val="left"/>
+            </w:pPr>
+            <w:r>
+              <w:rPr>
+                <w:rFonts w:ascii="Cambria" w:hAnsi="Cambria"/>
+                <w:sz w:val="20"/>
+              </w:rPr>
+              <w:t xml:space="preserve">  • Paksa 13.2: Nailathalang Balita at Panghihiram o Pagtutumbas ng Salita .............. 6</w:t>
+            </w:r>
+          </w:p>
+          <w:p>
+            <w:pPr>
+              <w:spacing w:before="0" w:after="40" w:line="276" w:lineRule="auto"/>
+              <w:jc w:val="left"/>
+            </w:pPr>
+            <w:r>
+              <w:rPr>
+                <w:rFonts w:ascii="Cambria" w:hAnsi="Cambria"/>
+                <w:sz w:val="20"/>
+              </w:rPr>
+              <w:t xml:space="preserve">  • Paksa 13.3: Etnisidad, Tekstong Biswal, at Gawaing Multimodal ........................... 9</w:t>
+            </w:r>
+          </w:p>
+          <w:p>
+            <w:pPr>
+              <w:spacing w:before="0" w:after="40" w:line="276" w:lineRule="auto"/>
+              <w:jc w:val="left"/>
+            </w:pPr>
+            <w:r>
+              <w:rPr>
+                <w:rFonts w:ascii="Cambria" w:hAnsi="Cambria"/>
+                <w:sz w:val="20"/>
+              </w:rPr>
+              <w:t xml:space="preserve">  • Mga Gawaing Pampagkatuto 13.1–13.3 at Mabilisang Pagtataya (15 Puntos) ........ 10</w:t>
+            </w:r>
+          </w:p>
+          <w:p>
+            <w:pPr>
+              <w:spacing w:before="0" w:after="40" w:line="276" w:lineRule="auto"/>
+              <w:jc w:val="left"/>
+            </w:pPr>
+            <w:r>
+              <w:rPr>
+                <w:rFonts w:ascii="Cambria" w:hAnsi="Cambria"/>
+                <w:sz w:val="20"/>
+              </w:rPr>
+              <w:t xml:space="preserve">  • Alokasyon ng Oras: 5 Sesyon (Sesyon 1 hanggang 5) ........................................ 15</w:t>
+            </w:r>
+          </w:p>
+          <w:p>
+            <w:pPr>
+              <w:spacing w:before="0" w:after="40" w:line="276" w:lineRule="auto"/>
+              <w:jc w:val="left"/>
+            </w:pPr>
+            <w:r>
+              <w:rPr>
+                <w:rFonts w:ascii="Cambria" w:hAnsi="Cambria"/>
+                <w:sz w:val="20"/>
+              </w:rPr>
+              <w:t>ARALIN 14: Pasyon at mga Tekstong Panrelihiyon sa Panahong Kolonyal .............. 16</w:t>
+            </w:r>
+          </w:p>
+          <w:p>
+            <w:pPr>
+              <w:spacing w:before="0" w:after="40" w:line="276" w:lineRule="auto"/>
+              <w:jc w:val="left"/>
+            </w:pPr>
+            <w:r>
+              <w:rPr>
+                <w:rFonts w:ascii="Cambria" w:hAnsi="Cambria"/>
+                <w:sz w:val="20"/>
+              </w:rPr>
+              <w:t xml:space="preserve">  • Lunsaran: Ang Pasyon bilang Panitikan at Kulturang Pasarraysay</w:t>
+            </w:r>
+          </w:p>
+          <w:p>
+            <w:pPr>
+              <w:spacing w:before="0" w:after="40" w:line="276" w:lineRule="auto"/>
+              <w:jc w:val="left"/>
+            </w:pPr>
+            <w:r>
+              <w:rPr>
+                <w:rFonts w:ascii="Cambria" w:hAnsi="Cambria"/>
+                <w:sz w:val="20"/>
+              </w:rPr>
+              <w:t xml:space="preserve">  • Paksa 14.1: Akdang Panrelihiyon—Anyo, Mensahe, Konteksto, at Tradisyon ........... 17</w:t>
+            </w:r>
+          </w:p>
+          <w:p>
+            <w:pPr>
+              <w:spacing w:before="0" w:after="40" w:line="276" w:lineRule="auto"/>
+              <w:jc w:val="left"/>
+            </w:pPr>
+            <w:r>
+              <w:rPr>
+                <w:rFonts w:ascii="Cambria" w:hAnsi="Cambria"/>
+                <w:sz w:val="20"/>
+              </w:rPr>
+              <w:t xml:space="preserve">  • Paksa 14.2: Mga Pahayagan at Wikang Nasusulat noong Panahon ng Espanyol ......... 18</w:t>
+            </w:r>
+          </w:p>
+          <w:p>
+            <w:pPr>
+              <w:spacing w:before="0" w:after="40" w:line="276" w:lineRule="auto"/>
+              <w:jc w:val="left"/>
+            </w:pPr>
+            <w:r>
+              <w:rPr>
+                <w:rFonts w:ascii="Cambria" w:hAnsi="Cambria"/>
+                <w:sz w:val="20"/>
+              </w:rPr>
+              <w:t xml:space="preserve">  • Paksa 14.3: Antas ng Pamumuhay at Elementong Biswal ng Comic Book Brochure ... 21</w:t>
+            </w:r>
+          </w:p>
+          <w:p>
+            <w:pPr>
+              <w:spacing w:before="0" w:after="40" w:line="276" w:lineRule="auto"/>
+              <w:jc w:val="left"/>
+            </w:pPr>
+            <w:r>
+              <w:rPr>
+                <w:rFonts w:ascii="Cambria" w:hAnsi="Cambria"/>
+                <w:sz w:val="20"/>
+              </w:rPr>
+              <w:t xml:space="preserve">  • Mga Gawaing Pampagkatuto 14.1–14.3 at Mabilisang Pagtataya (15 Puntos) ........ 22</w:t>
+            </w:r>
+          </w:p>
+          <w:p>
+            <w:pPr>
+              <w:spacing w:before="0" w:after="40" w:line="276" w:lineRule="auto"/>
+              <w:jc w:val="left"/>
+            </w:pPr>
+            <w:r>
+              <w:rPr>
+                <w:rFonts w:ascii="Cambria" w:hAnsi="Cambria"/>
+                <w:sz w:val="20"/>
+              </w:rPr>
+              <w:t xml:space="preserve">  • Alokasyon ng Oras: 5 Sesyon (Sesyon 6 hanggang 10) ...................................... 27</w:t>
+            </w:r>
+          </w:p>
+          <w:p>
+            <w:pPr>
+              <w:spacing w:before="0" w:after="40" w:line="276" w:lineRule="auto"/>
+              <w:jc w:val="left"/>
+            </w:pPr>
+            <w:r>
+              <w:rPr>
+                <w:rFonts w:ascii="Cambria" w:hAnsi="Cambria"/>
+                <w:sz w:val="20"/>
+              </w:rPr>
+              <w:t>ARALIN 15: Ang Liham ni Urbana kay Feliza tungkol sa Kalinisan ....................... 28</w:t>
+            </w:r>
+          </w:p>
+          <w:p>
+            <w:pPr>
+              <w:spacing w:before="0" w:after="40" w:line="276" w:lineRule="auto"/>
+              <w:jc w:val="left"/>
+            </w:pPr>
+            <w:r>
+              <w:rPr>
+                <w:rFonts w:ascii="Cambria" w:hAnsi="Cambria"/>
+                <w:sz w:val="20"/>
+              </w:rPr>
+              <w:t xml:space="preserve">  • Lunsaran: Akdang Pangkagandahang-asal at Wikang Didaktiko</w:t>
+            </w:r>
+          </w:p>
+          <w:p>
+            <w:pPr>
+              <w:spacing w:before="0" w:after="40" w:line="276" w:lineRule="auto"/>
+              <w:jc w:val="left"/>
+            </w:pPr>
+            <w:r>
+              <w:rPr>
+                <w:rFonts w:ascii="Cambria" w:hAnsi="Cambria"/>
+                <w:sz w:val="20"/>
+              </w:rPr>
+              <w:t xml:space="preserve">  • Paksa 15.1: Mensahe, Pagpapahalaga, at Konteksto ng Akdang Pangkagandahang-asal .. 29</w:t>
+            </w:r>
+          </w:p>
+          <w:p>
+            <w:pPr>
+              <w:spacing w:before="0" w:after="40" w:line="276" w:lineRule="auto"/>
+              <w:jc w:val="left"/>
+            </w:pPr>
+            <w:r>
+              <w:rPr>
+                <w:rFonts w:ascii="Cambria" w:hAnsi="Cambria"/>
+                <w:sz w:val="20"/>
+              </w:rPr>
+              <w:t xml:space="preserve">  • Paksa 15.2: Pagkuha ng Impormasyon para sa Balita at Wikang Gamit sa Panayam .... 30</w:t>
+            </w:r>
+          </w:p>
+          <w:p>
+            <w:pPr>
+              <w:spacing w:before="0" w:after="40" w:line="276" w:lineRule="auto"/>
+              <w:jc w:val="left"/>
+            </w:pPr>
+            <w:r>
+              <w:rPr>
+                <w:rFonts w:ascii="Cambria" w:hAnsi="Cambria"/>
+                <w:sz w:val="20"/>
+              </w:rPr>
+              <w:t xml:space="preserve">  • Paksa 15.3: Kababaihan sa Panahon ng Espanyol at Pagwawasto ng Diyalogo .......... 33</w:t>
+            </w:r>
+          </w:p>
+          <w:p>
+            <w:pPr>
+              <w:spacing w:before="0" w:after="40" w:line="276" w:lineRule="auto"/>
+              <w:jc w:val="left"/>
+            </w:pPr>
+            <w:r>
+              <w:rPr>
+                <w:rFonts w:ascii="Cambria" w:hAnsi="Cambria"/>
+                <w:sz w:val="20"/>
+              </w:rPr>
+              <w:t xml:space="preserve">  • Mga Gawaing Pampagkatuto 15.1–15.3 at Mabilisang Pagtataya (15 Puntos) ........ 34</w:t>
+            </w:r>
+          </w:p>
+          <w:p>
+            <w:pPr>
+              <w:spacing w:before="0" w:after="40" w:line="276" w:lineRule="auto"/>
+              <w:jc w:val="left"/>
+            </w:pPr>
+            <w:r>
+              <w:rPr>
+                <w:rFonts w:ascii="Cambria" w:hAnsi="Cambria"/>
+                <w:sz w:val="20"/>
+              </w:rPr>
+              <w:t xml:space="preserve">  • Alokasyon ng Oras: 5 Sesyon (Sesyon 11 hanggang 15) ..................................... 39</w:t>
+            </w:r>
+          </w:p>
+          <w:p>
+            <w:pPr>
+              <w:spacing w:before="0" w:after="40" w:line="276" w:lineRule="auto"/>
+              <w:jc w:val="left"/>
+            </w:pPr>
+            <w:r>
+              <w:rPr>
+                <w:rFonts w:ascii="Cambria" w:hAnsi="Cambria"/>
+                <w:sz w:val="20"/>
+              </w:rPr>
+              <w:t>PANGWAKAS NA PAGTATAYA SA YUNIT III (KABUUANG 40 PUNTOS) ........................... 40</w:t>
+            </w:r>
+          </w:p>
+          <w:p>
+            <w:pPr>
+              <w:spacing w:before="0" w:after="40" w:line="276" w:lineRule="auto"/>
+              <w:jc w:val="left"/>
+            </w:pPr>
+            <w:r>
+              <w:rPr>
+                <w:rFonts w:ascii="Cambria" w:hAnsi="Cambria"/>
+                <w:sz w:val="20"/>
+              </w:rPr>
+              <w:t xml:space="preserve">  • Bahagi I–IV: Pagsusuri ng Batis, Konsepto, Sanaysay, at GRASPS Comic Brochure .. 40</w:t>
+            </w:r>
+          </w:p>
+          <w:p>
+            <w:pPr>
+              <w:spacing w:before="0" w:after="40" w:line="276" w:lineRule="auto"/>
+              <w:jc w:val="left"/>
+            </w:pPr>
+            <w:r>
+              <w:rPr>
+                <w:rFonts w:ascii="Cambria" w:hAnsi="Cambria"/>
+                <w:sz w:val="20"/>
+              </w:rPr>
+              <w:t>BUOD NG YUNIT III AT KOMPREHENSIBONG TALATINIGAN (25 KONSEPTO) .................... 43</w:t>
+            </w:r>
+          </w:p>
+          <w:p>
+            <w:pPr>
+              <w:spacing w:before="0" w:after="40" w:line="276" w:lineRule="auto"/>
+              <w:jc w:val="left"/>
+            </w:pPr>
+            <w:r>
+              <w:rPr>
+                <w:rFonts w:ascii="Cambria" w:hAnsi="Cambria"/>
+                <w:sz w:val="20"/>
+              </w:rPr>
+              <w:t>KOMPLETONG SUSI SA PAGWAWASTO, RASYONAL, AT GABAY SA GURO ......................... 44</w:t>
+            </w:r>
+          </w:p>
+        </w:tc>
+      </w:tr>
+    </w:tbl>
+    <w:p>
+      <w:pPr>
+        <w:spacing w:after="40"/>
+      </w:pPr>
+    </w:p>
+    <w:p>
+      <w:r>
+        <w:br w:type="page"/>
+      </w:r>
+    </w:p>
+    <w:tbl>
+      <w:tblPr>
+        <w:tblW w:type="auto" w:w="0"/>
+        <w:jc w:val="center"/>
+        <w:tblLook w:firstColumn="1" w:firstRow="1" w:lastColumn="0" w:lastRow="0" w:noHBand="0" w:noVBand="1" w:val="04A0"/>
+        <w:tblBorders>
+          <w:top w:val="none"/>
+          <w:left w:val="none"/>
+          <w:bottom w:val="none"/>
+          <w:right w:val="none"/>
+          <w:insideH w:val="none"/>
+          <w:insideV w:val="none"/>
+        </w:tblBorders>
+      </w:tblPr>
+      <w:tblGrid>
+        <w:gridCol w:w="9936"/>
+      </w:tblGrid>
+      <w:tr>
+        <w:trPr>
+          <w:cantSplit/>
+          <w:tblHeader/>
+        </w:trPr>
+        <w:tc>
+          <w:tcPr>
+            <w:tcW w:type="dxa" w:w="9936"/>
+            <w:shd w:fill="1B365D"/>
+            <w:tcMar>
+              <w:top w:w="100" w:type="dxa"/>
+              <w:bottom w:w="100" w:type="dxa"/>
+              <w:left w:w="150" w:type="dxa"/>
+              <w:right w:w="150" w:type="dxa"/>
+            </w:tcMar>
+          </w:tcPr>
+          <w:p>
+            <w:pPr>
+              <w:spacing w:before="40" w:after="40" w:line="276" w:lineRule="auto"/>
+              <w:jc w:val="center"/>
+            </w:pPr>
+            <w:r>
+              <w:rPr>
+                <w:rFonts w:ascii="Cambria" w:hAnsi="Cambria"/>
+                <w:b/>
+                <w:color w:val="FFFFFF"/>
+                <w:sz w:val="27"/>
+              </w:rPr>
+              <w:t>ARALIN 13: Ang Panitikan sa Panahong Sakop ng Espanya ang Pilipinas</w:t>
+            </w:r>
+          </w:p>
+        </w:tc>
+      </w:tr>
+    </w:tbl>
+    <w:p>
+      <w:pPr>
+        <w:spacing w:after="80"/>
+      </w:pPr>
+    </w:p>
+    <w:tbl>
+      <w:tblPr>
+        <w:tblW w:type="auto" w:w="0"/>
+        <w:jc w:val="center"/>
+        <w:tblLook w:firstColumn="1" w:firstRow="1" w:lastColumn="0" w:lastRow="0" w:noHBand="0" w:noVBand="1" w:val="04A0"/>
+      </w:tblPr>
+      <w:tblGrid>
+        <w:gridCol w:w="9936"/>
+      </w:tblGrid>
+      <w:tr>
+        <w:trPr>
+          <w:cantSplit/>
+          <w:tblHeader/>
+        </w:trPr>
         <w:tc>
           <w:tcPr>
             <w:tcW w:type="dxa" w:w="9936"/>
@@ -1365,6 +923,10 @@
         <w:gridCol w:w="9936"/>
       </w:tblGrid>
       <w:tr>
+        <w:trPr>
+          <w:cantSplit/>
+          <w:tblHeader/>
+        </w:trPr>
         <w:tc>
           <w:tcPr>
             <w:tcW w:type="dxa" w:w="9936"/>
@@ -1558,6 +1120,10 @@
         <w:gridCol w:w="9936"/>
       </w:tblGrid>
       <w:tr>
+        <w:trPr>
+          <w:cantSplit/>
+          <w:tblHeader/>
+        </w:trPr>
         <w:tc>
           <w:tcPr>
             <w:tcW w:type="dxa" w:w="9936"/>
@@ -1608,6 +1174,10 @@
         <w:gridCol w:w="9936"/>
       </w:tblGrid>
       <w:tr>
+        <w:trPr>
+          <w:cantSplit/>
+          <w:tblHeader/>
+        </w:trPr>
         <w:tc>
           <w:tcPr>
             <w:tcW w:type="dxa" w:w="9936"/>
@@ -1715,6 +1285,10 @@
         <w:gridCol w:w="9936"/>
       </w:tblGrid>
       <w:tr>
+        <w:trPr>
+          <w:cantSplit/>
+          <w:tblHeader/>
+        </w:trPr>
         <w:tc>
           <w:tcPr>
             <w:tcW w:type="dxa" w:w="9936"/>
@@ -1791,6 +1365,10 @@
         <w:gridCol w:w="2484"/>
       </w:tblGrid>
       <w:tr>
+        <w:trPr>
+          <w:cantSplit/>
+          <w:tblHeader/>
+        </w:trPr>
         <w:tc>
           <w:tcPr>
             <w:tcW w:type="dxa" w:w="2484"/>
@@ -1901,6 +1479,9 @@
         </w:tc>
       </w:tr>
       <w:tr>
+        <w:trPr>
+          <w:cantSplit/>
+        </w:trPr>
         <w:tc>
           <w:tcPr>
             <w:tcW w:type="dxa" w:w="2484"/>
@@ -2007,6 +1588,9 @@
         </w:tc>
       </w:tr>
       <w:tr>
+        <w:trPr>
+          <w:cantSplit/>
+        </w:trPr>
         <w:tc>
           <w:tcPr>
             <w:tcW w:type="dxa" w:w="2484"/>
@@ -2113,6 +1697,9 @@
         </w:tc>
       </w:tr>
       <w:tr>
+        <w:trPr>
+          <w:cantSplit/>
+        </w:trPr>
         <w:tc>
           <w:tcPr>
             <w:tcW w:type="dxa" w:w="2484"/>
@@ -2248,6 +1835,10 @@
         <w:gridCol w:w="9936"/>
       </w:tblGrid>
       <w:tr>
+        <w:trPr>
+          <w:cantSplit/>
+          <w:tblHeader/>
+        </w:trPr>
         <w:tc>
           <w:tcPr>
             <w:tcW w:type="dxa" w:w="9936"/>
@@ -2337,6 +1928,10 @@
         <w:gridCol w:w="9936"/>
       </w:tblGrid>
       <w:tr>
+        <w:trPr>
+          <w:cantSplit/>
+          <w:tblHeader/>
+        </w:trPr>
         <w:tc>
           <w:tcPr>
             <w:tcW w:type="dxa" w:w="9936"/>
@@ -2387,6 +1982,10 @@
         <w:gridCol w:w="9936"/>
       </w:tblGrid>
       <w:tr>
+        <w:trPr>
+          <w:cantSplit/>
+          <w:tblHeader/>
+        </w:trPr>
         <w:tc>
           <w:tcPr>
             <w:tcW w:type="dxa" w:w="9936"/>
@@ -2505,6 +2104,10 @@
         <w:gridCol w:w="2484"/>
       </w:tblGrid>
       <w:tr>
+        <w:trPr>
+          <w:cantSplit/>
+          <w:tblHeader/>
+        </w:trPr>
         <w:tc>
           <w:tcPr>
             <w:tcW w:type="dxa" w:w="2484"/>
@@ -2615,6 +2218,9 @@
         </w:tc>
       </w:tr>
       <w:tr>
+        <w:trPr>
+          <w:cantSplit/>
+        </w:trPr>
         <w:tc>
           <w:tcPr>
             <w:tcW w:type="dxa" w:w="2484"/>
@@ -2721,6 +2327,9 @@
         </w:tc>
       </w:tr>
       <w:tr>
+        <w:trPr>
+          <w:cantSplit/>
+        </w:trPr>
         <w:tc>
           <w:tcPr>
             <w:tcW w:type="dxa" w:w="2484"/>
@@ -2827,6 +2436,9 @@
         </w:tc>
       </w:tr>
       <w:tr>
+        <w:trPr>
+          <w:cantSplit/>
+        </w:trPr>
         <w:tc>
           <w:tcPr>
             <w:tcW w:type="dxa" w:w="2484"/>
@@ -2962,6 +2574,10 @@
         <w:gridCol w:w="9936"/>
       </w:tblGrid>
       <w:tr>
+        <w:trPr>
+          <w:cantSplit/>
+          <w:tblHeader/>
+        </w:trPr>
         <w:tc>
           <w:tcPr>
             <w:tcW w:type="dxa" w:w="9936"/>
@@ -3051,6 +2667,10 @@
         <w:gridCol w:w="9936"/>
       </w:tblGrid>
       <w:tr>
+        <w:trPr>
+          <w:cantSplit/>
+          <w:tblHeader/>
+        </w:trPr>
         <w:tc>
           <w:tcPr>
             <w:tcW w:type="dxa" w:w="9936"/>
@@ -3101,6 +2721,10 @@
         <w:gridCol w:w="9936"/>
       </w:tblGrid>
       <w:tr>
+        <w:trPr>
+          <w:cantSplit/>
+          <w:tblHeader/>
+        </w:trPr>
         <w:tc>
           <w:tcPr>
             <w:tcW w:type="dxa" w:w="9936"/>
@@ -3236,6 +2860,10 @@
         <w:gridCol w:w="9936"/>
       </w:tblGrid>
       <w:tr>
+        <w:trPr>
+          <w:cantSplit/>
+          <w:tblHeader/>
+        </w:trPr>
         <w:tc>
           <w:tcPr>
             <w:tcW w:type="dxa" w:w="9936"/>
@@ -3338,6 +2966,10 @@
         <w:gridCol w:w="9936"/>
       </w:tblGrid>
       <w:tr>
+        <w:trPr>
+          <w:cantSplit/>
+          <w:tblHeader/>
+        </w:trPr>
         <w:tc>
           <w:tcPr>
             <w:tcW w:type="dxa" w:w="9936"/>
@@ -3600,6 +3232,10 @@
         <w:gridCol w:w="9936"/>
       </w:tblGrid>
       <w:tr>
+        <w:trPr>
+          <w:cantSplit/>
+          <w:tblHeader/>
+        </w:trPr>
         <w:tc>
           <w:tcPr>
             <w:tcW w:type="dxa" w:w="9936"/>
@@ -3689,6 +3325,10 @@
         <w:gridCol w:w="9936"/>
       </w:tblGrid>
       <w:tr>
+        <w:trPr>
+          <w:cantSplit/>
+          <w:tblHeader/>
+        </w:trPr>
         <w:tc>
           <w:tcPr>
             <w:tcW w:type="dxa" w:w="9936"/>
@@ -3767,6 +3407,10 @@
         <w:gridCol w:w="9936"/>
       </w:tblGrid>
       <w:tr>
+        <w:trPr>
+          <w:cantSplit/>
+          <w:tblHeader/>
+        </w:trPr>
         <w:tc>
           <w:tcPr>
             <w:tcW w:type="dxa" w:w="9936"/>
@@ -3856,6 +3500,10 @@
         <w:gridCol w:w="3312"/>
       </w:tblGrid>
       <w:tr>
+        <w:trPr>
+          <w:cantSplit/>
+          <w:tblHeader/>
+        </w:trPr>
         <w:tc>
           <w:tcPr>
             <w:tcW w:type="dxa" w:w="3312"/>
@@ -3939,6 +3587,9 @@
         </w:tc>
       </w:tr>
       <w:tr>
+        <w:trPr>
+          <w:cantSplit/>
+        </w:trPr>
         <w:tc>
           <w:tcPr>
             <w:tcW w:type="dxa" w:w="3312"/>
@@ -4019,6 +3670,9 @@
         </w:tc>
       </w:tr>
       <w:tr>
+        <w:trPr>
+          <w:cantSplit/>
+        </w:trPr>
         <w:tc>
           <w:tcPr>
             <w:tcW w:type="dxa" w:w="3312"/>
@@ -4099,6 +3753,9 @@
         </w:tc>
       </w:tr>
       <w:tr>
+        <w:trPr>
+          <w:cantSplit/>
+        </w:trPr>
         <w:tc>
           <w:tcPr>
             <w:tcW w:type="dxa" w:w="3312"/>
@@ -4179,6 +3836,9 @@
         </w:tc>
       </w:tr>
       <w:tr>
+        <w:trPr>
+          <w:cantSplit/>
+        </w:trPr>
         <w:tc>
           <w:tcPr>
             <w:tcW w:type="dxa" w:w="3312"/>
@@ -4274,6 +3934,10 @@
         <w:gridCol w:w="9936"/>
       </w:tblGrid>
       <w:tr>
+        <w:trPr>
+          <w:cantSplit/>
+          <w:tblHeader/>
+        </w:trPr>
         <w:tc>
           <w:tcPr>
             <w:tcW w:type="dxa" w:w="9936"/>
@@ -4363,6 +4027,10 @@
         <w:gridCol w:w="9936"/>
       </w:tblGrid>
       <w:tr>
+        <w:trPr>
+          <w:cantSplit/>
+          <w:tblHeader/>
+        </w:trPr>
         <w:tc>
           <w:tcPr>
             <w:tcW w:type="dxa" w:w="9936"/>
@@ -4552,6 +4220,10 @@
         <w:gridCol w:w="2484"/>
       </w:tblGrid>
       <w:tr>
+        <w:trPr>
+          <w:cantSplit/>
+          <w:tblHeader/>
+        </w:trPr>
         <w:tc>
           <w:tcPr>
             <w:tcW w:type="dxa" w:w="2484"/>
@@ -4662,6 +4334,9 @@
         </w:tc>
       </w:tr>
       <w:tr>
+        <w:trPr>
+          <w:cantSplit/>
+        </w:trPr>
         <w:tc>
           <w:tcPr>
             <w:tcW w:type="dxa" w:w="2484"/>
@@ -4768,6 +4443,9 @@
         </w:tc>
       </w:tr>
       <w:tr>
+        <w:trPr>
+          <w:cantSplit/>
+        </w:trPr>
         <w:tc>
           <w:tcPr>
             <w:tcW w:type="dxa" w:w="2484"/>
@@ -4874,6 +4552,9 @@
         </w:tc>
       </w:tr>
       <w:tr>
+        <w:trPr>
+          <w:cantSplit/>
+        </w:trPr>
         <w:tc>
           <w:tcPr>
             <w:tcW w:type="dxa" w:w="2484"/>
@@ -4980,6 +4661,9 @@
         </w:tc>
       </w:tr>
       <w:tr>
+        <w:trPr>
+          <w:cantSplit/>
+        </w:trPr>
         <w:tc>
           <w:tcPr>
             <w:tcW w:type="dxa" w:w="2484"/>
@@ -5086,6 +4770,9 @@
         </w:tc>
       </w:tr>
       <w:tr>
+        <w:trPr>
+          <w:cantSplit/>
+        </w:trPr>
         <w:tc>
           <w:tcPr>
             <w:tcW w:type="dxa" w:w="2484"/>
@@ -5207,6 +4894,10 @@
         <w:gridCol w:w="9936"/>
       </w:tblGrid>
       <w:tr>
+        <w:trPr>
+          <w:cantSplit/>
+          <w:tblHeader/>
+        </w:trPr>
         <w:tc>
           <w:tcPr>
             <w:tcW w:type="dxa" w:w="9936"/>
@@ -5270,6 +4961,10 @@
         <w:gridCol w:w="9936"/>
       </w:tblGrid>
       <w:tr>
+        <w:trPr>
+          <w:cantSplit/>
+          <w:tblHeader/>
+        </w:trPr>
         <w:tc>
           <w:tcPr>
             <w:tcW w:type="dxa" w:w="9936"/>
@@ -5374,6 +5069,10 @@
         <w:gridCol w:w="1987"/>
       </w:tblGrid>
       <w:tr>
+        <w:trPr>
+          <w:cantSplit/>
+          <w:tblHeader/>
+        </w:trPr>
         <w:tc>
           <w:tcPr>
             <w:tcW w:type="dxa" w:w="1987"/>
@@ -5511,6 +5210,9 @@
         </w:tc>
       </w:tr>
       <w:tr>
+        <w:trPr>
+          <w:cantSplit/>
+        </w:trPr>
         <w:tc>
           <w:tcPr>
             <w:tcW w:type="dxa" w:w="1987"/>
@@ -5643,6 +5345,9 @@
         </w:tc>
       </w:tr>
       <w:tr>
+        <w:trPr>
+          <w:cantSplit/>
+        </w:trPr>
         <w:tc>
           <w:tcPr>
             <w:tcW w:type="dxa" w:w="1987"/>
@@ -5775,6 +5480,9 @@
         </w:tc>
       </w:tr>
       <w:tr>
+        <w:trPr>
+          <w:cantSplit/>
+        </w:trPr>
         <w:tc>
           <w:tcPr>
             <w:tcW w:type="dxa" w:w="1987"/>
@@ -5907,6 +5615,9 @@
         </w:tc>
       </w:tr>
       <w:tr>
+        <w:trPr>
+          <w:cantSplit/>
+        </w:trPr>
         <w:tc>
           <w:tcPr>
             <w:tcW w:type="dxa" w:w="1987"/>
@@ -6054,6 +5765,10 @@
         <w:gridCol w:w="9936"/>
       </w:tblGrid>
       <w:tr>
+        <w:trPr>
+          <w:cantSplit/>
+          <w:tblHeader/>
+        </w:trPr>
         <w:tc>
           <w:tcPr>
             <w:tcW w:type="dxa" w:w="9936"/>
@@ -6222,6 +5937,10 @@
         <w:gridCol w:w="9936"/>
       </w:tblGrid>
       <w:tr>
+        <w:trPr>
+          <w:cantSplit/>
+          <w:tblHeader/>
+        </w:trPr>
         <w:tc>
           <w:tcPr>
             <w:tcW w:type="dxa" w:w="9936"/>
@@ -6324,6 +6043,10 @@
         <w:gridCol w:w="9936"/>
       </w:tblGrid>
       <w:tr>
+        <w:trPr>
+          <w:cantSplit/>
+          <w:tblHeader/>
+        </w:trPr>
         <w:tc>
           <w:tcPr>
             <w:tcW w:type="dxa" w:w="9936"/>
@@ -6963,6 +6686,10 @@
         <w:gridCol w:w="9936"/>
       </w:tblGrid>
       <w:tr>
+        <w:trPr>
+          <w:cantSplit/>
+          <w:tblHeader/>
+        </w:trPr>
         <w:tc>
           <w:tcPr>
             <w:tcW w:type="dxa" w:w="9936"/>
@@ -7267,6 +6994,10 @@
         <w:gridCol w:w="9936"/>
       </w:tblGrid>
       <w:tr>
+        <w:trPr>
+          <w:cantSplit/>
+          <w:tblHeader/>
+        </w:trPr>
         <w:tc>
           <w:tcPr>
             <w:tcW w:type="dxa" w:w="9936"/>
@@ -7356,6 +7087,10 @@
         <w:gridCol w:w="9936"/>
       </w:tblGrid>
       <w:tr>
+        <w:trPr>
+          <w:cantSplit/>
+          <w:tblHeader/>
+        </w:trPr>
         <w:tc>
           <w:tcPr>
             <w:tcW w:type="dxa" w:w="9936"/>
@@ -7434,6 +7169,10 @@
         <w:gridCol w:w="9936"/>
       </w:tblGrid>
       <w:tr>
+        <w:trPr>
+          <w:cantSplit/>
+          <w:tblHeader/>
+        </w:trPr>
         <w:tc>
           <w:tcPr>
             <w:tcW w:type="dxa" w:w="9936"/>
@@ -7536,6 +7275,10 @@
         <w:gridCol w:w="9936"/>
       </w:tblGrid>
       <w:tr>
+        <w:trPr>
+          <w:cantSplit/>
+          <w:tblHeader/>
+        </w:trPr>
         <w:tc>
           <w:tcPr>
             <w:tcW w:type="dxa" w:w="9936"/>
@@ -7580,6 +7323,10 @@
         <w:gridCol w:w="9936"/>
       </w:tblGrid>
       <w:tr>
+        <w:trPr>
+          <w:cantSplit/>
+          <w:tblHeader/>
+        </w:trPr>
         <w:tc>
           <w:tcPr>
             <w:tcW w:type="dxa" w:w="9936"/>
@@ -7704,6 +7451,10 @@
         <w:gridCol w:w="9936"/>
       </w:tblGrid>
       <w:tr>
+        <w:trPr>
+          <w:cantSplit/>
+          <w:tblHeader/>
+        </w:trPr>
         <w:tc>
           <w:tcPr>
             <w:tcW w:type="dxa" w:w="9936"/>
@@ -7897,6 +7648,10 @@
         <w:gridCol w:w="9936"/>
       </w:tblGrid>
       <w:tr>
+        <w:trPr>
+          <w:cantSplit/>
+          <w:tblHeader/>
+        </w:trPr>
         <w:tc>
           <w:tcPr>
             <w:tcW w:type="dxa" w:w="9936"/>
@@ -7947,6 +7702,10 @@
         <w:gridCol w:w="9936"/>
       </w:tblGrid>
       <w:tr>
+        <w:trPr>
+          <w:cantSplit/>
+          <w:tblHeader/>
+        </w:trPr>
         <w:tc>
           <w:tcPr>
             <w:tcW w:type="dxa" w:w="9936"/>
@@ -8065,6 +7824,10 @@
         <w:gridCol w:w="2484"/>
       </w:tblGrid>
       <w:tr>
+        <w:trPr>
+          <w:cantSplit/>
+          <w:tblHeader/>
+        </w:trPr>
         <w:tc>
           <w:tcPr>
             <w:tcW w:type="dxa" w:w="2484"/>
@@ -8175,6 +7938,9 @@
         </w:tc>
       </w:tr>
       <w:tr>
+        <w:trPr>
+          <w:cantSplit/>
+        </w:trPr>
         <w:tc>
           <w:tcPr>
             <w:tcW w:type="dxa" w:w="2484"/>
@@ -8281,6 +8047,9 @@
         </w:tc>
       </w:tr>
       <w:tr>
+        <w:trPr>
+          <w:cantSplit/>
+        </w:trPr>
         <w:tc>
           <w:tcPr>
             <w:tcW w:type="dxa" w:w="2484"/>
@@ -8387,6 +8156,9 @@
         </w:tc>
       </w:tr>
       <w:tr>
+        <w:trPr>
+          <w:cantSplit/>
+        </w:trPr>
         <w:tc>
           <w:tcPr>
             <w:tcW w:type="dxa" w:w="2484"/>
@@ -8493,6 +8265,9 @@
         </w:tc>
       </w:tr>
       <w:tr>
+        <w:trPr>
+          <w:cantSplit/>
+        </w:trPr>
         <w:tc>
           <w:tcPr>
             <w:tcW w:type="dxa" w:w="2484"/>
@@ -8628,6 +8403,10 @@
         <w:gridCol w:w="9936"/>
       </w:tblGrid>
       <w:tr>
+        <w:trPr>
+          <w:cantSplit/>
+          <w:tblHeader/>
+        </w:trPr>
         <w:tc>
           <w:tcPr>
             <w:tcW w:type="dxa" w:w="9936"/>
@@ -8717,6 +8496,10 @@
         <w:gridCol w:w="9936"/>
       </w:tblGrid>
       <w:tr>
+        <w:trPr>
+          <w:cantSplit/>
+          <w:tblHeader/>
+        </w:trPr>
         <w:tc>
           <w:tcPr>
             <w:tcW w:type="dxa" w:w="9936"/>
@@ -8767,6 +8550,10 @@
         <w:gridCol w:w="9936"/>
       </w:tblGrid>
       <w:tr>
+        <w:trPr>
+          <w:cantSplit/>
+          <w:tblHeader/>
+        </w:trPr>
         <w:tc>
           <w:tcPr>
             <w:tcW w:type="dxa" w:w="9936"/>
@@ -8885,6 +8672,10 @@
         <w:gridCol w:w="2484"/>
       </w:tblGrid>
       <w:tr>
+        <w:trPr>
+          <w:cantSplit/>
+          <w:tblHeader/>
+        </w:trPr>
         <w:tc>
           <w:tcPr>
             <w:tcW w:type="dxa" w:w="2484"/>
@@ -8995,6 +8786,9 @@
         </w:tc>
       </w:tr>
       <w:tr>
+        <w:trPr>
+          <w:cantSplit/>
+        </w:trPr>
         <w:tc>
           <w:tcPr>
             <w:tcW w:type="dxa" w:w="2484"/>
@@ -9101,6 +8895,9 @@
         </w:tc>
       </w:tr>
       <w:tr>
+        <w:trPr>
+          <w:cantSplit/>
+        </w:trPr>
         <w:tc>
           <w:tcPr>
             <w:tcW w:type="dxa" w:w="2484"/>
@@ -9207,6 +9004,9 @@
         </w:tc>
       </w:tr>
       <w:tr>
+        <w:trPr>
+          <w:cantSplit/>
+        </w:trPr>
         <w:tc>
           <w:tcPr>
             <w:tcW w:type="dxa" w:w="2484"/>
@@ -9313,6 +9113,9 @@
         </w:tc>
       </w:tr>
       <w:tr>
+        <w:trPr>
+          <w:cantSplit/>
+        </w:trPr>
         <w:tc>
           <w:tcPr>
             <w:tcW w:type="dxa" w:w="2484"/>
@@ -9448,6 +9251,10 @@
         <w:gridCol w:w="9936"/>
       </w:tblGrid>
       <w:tr>
+        <w:trPr>
+          <w:cantSplit/>
+          <w:tblHeader/>
+        </w:trPr>
         <w:tc>
           <w:tcPr>
             <w:tcW w:type="dxa" w:w="9936"/>
@@ -9537,6 +9344,10 @@
         <w:gridCol w:w="9936"/>
       </w:tblGrid>
       <w:tr>
+        <w:trPr>
+          <w:cantSplit/>
+          <w:tblHeader/>
+        </w:trPr>
         <w:tc>
           <w:tcPr>
             <w:tcW w:type="dxa" w:w="9936"/>
@@ -9587,6 +9398,10 @@
         <w:gridCol w:w="9936"/>
       </w:tblGrid>
       <w:tr>
+        <w:trPr>
+          <w:cantSplit/>
+          <w:tblHeader/>
+        </w:trPr>
         <w:tc>
           <w:tcPr>
             <w:tcW w:type="dxa" w:w="9936"/>
@@ -9779,6 +9594,10 @@
         <w:gridCol w:w="9936"/>
       </w:tblGrid>
       <w:tr>
+        <w:trPr>
+          <w:cantSplit/>
+          <w:tblHeader/>
+        </w:trPr>
         <w:tc>
           <w:tcPr>
             <w:tcW w:type="dxa" w:w="9936"/>
@@ -9868,6 +9687,10 @@
         <w:gridCol w:w="9936"/>
       </w:tblGrid>
       <w:tr>
+        <w:trPr>
+          <w:cantSplit/>
+          <w:tblHeader/>
+        </w:trPr>
         <w:tc>
           <w:tcPr>
             <w:tcW w:type="dxa" w:w="9936"/>
@@ -10130,6 +9953,10 @@
         <w:gridCol w:w="9936"/>
       </w:tblGrid>
       <w:tr>
+        <w:trPr>
+          <w:cantSplit/>
+          <w:tblHeader/>
+        </w:trPr>
         <w:tc>
           <w:tcPr>
             <w:tcW w:type="dxa" w:w="9936"/>
@@ -10219,6 +10046,10 @@
         <w:gridCol w:w="9936"/>
       </w:tblGrid>
       <w:tr>
+        <w:trPr>
+          <w:cantSplit/>
+          <w:tblHeader/>
+        </w:trPr>
         <w:tc>
           <w:tcPr>
             <w:tcW w:type="dxa" w:w="9936"/>
@@ -10297,6 +10128,10 @@
         <w:gridCol w:w="9936"/>
       </w:tblGrid>
       <w:tr>
+        <w:trPr>
+          <w:cantSplit/>
+          <w:tblHeader/>
+        </w:trPr>
         <w:tc>
           <w:tcPr>
             <w:tcW w:type="dxa" w:w="9936"/>
@@ -10387,6 +10222,10 @@
         <w:gridCol w:w="2484"/>
       </w:tblGrid>
       <w:tr>
+        <w:trPr>
+          <w:cantSplit/>
+          <w:tblHeader/>
+        </w:trPr>
         <w:tc>
           <w:tcPr>
             <w:tcW w:type="dxa" w:w="2484"/>
@@ -10497,6 +10336,9 @@
         </w:tc>
       </w:tr>
       <w:tr>
+        <w:trPr>
+          <w:cantSplit/>
+        </w:trPr>
         <w:tc>
           <w:tcPr>
             <w:tcW w:type="dxa" w:w="2484"/>
@@ -10603,6 +10445,9 @@
         </w:tc>
       </w:tr>
       <w:tr>
+        <w:trPr>
+          <w:cantSplit/>
+        </w:trPr>
         <w:tc>
           <w:tcPr>
             <w:tcW w:type="dxa" w:w="2484"/>
@@ -10709,6 +10554,9 @@
         </w:tc>
       </w:tr>
       <w:tr>
+        <w:trPr>
+          <w:cantSplit/>
+        </w:trPr>
         <w:tc>
           <w:tcPr>
             <w:tcW w:type="dxa" w:w="2484"/>
@@ -10815,6 +10663,9 @@
         </w:tc>
       </w:tr>
       <w:tr>
+        <w:trPr>
+          <w:cantSplit/>
+        </w:trPr>
         <w:tc>
           <w:tcPr>
             <w:tcW w:type="dxa" w:w="2484"/>
@@ -10936,6 +10787,10 @@
         <w:gridCol w:w="9936"/>
       </w:tblGrid>
       <w:tr>
+        <w:trPr>
+          <w:cantSplit/>
+          <w:tblHeader/>
+        </w:trPr>
         <w:tc>
           <w:tcPr>
             <w:tcW w:type="dxa" w:w="9936"/>
@@ -11025,6 +10880,10 @@
         <w:gridCol w:w="9936"/>
       </w:tblGrid>
       <w:tr>
+        <w:trPr>
+          <w:cantSplit/>
+          <w:tblHeader/>
+        </w:trPr>
         <w:tc>
           <w:tcPr>
             <w:tcW w:type="dxa" w:w="9936"/>
@@ -11115,6 +10974,10 @@
         <w:gridCol w:w="2484"/>
       </w:tblGrid>
       <w:tr>
+        <w:trPr>
+          <w:cantSplit/>
+          <w:tblHeader/>
+        </w:trPr>
         <w:tc>
           <w:tcPr>
             <w:tcW w:type="dxa" w:w="2484"/>
@@ -11225,6 +11088,9 @@
         </w:tc>
       </w:tr>
       <w:tr>
+        <w:trPr>
+          <w:cantSplit/>
+        </w:trPr>
         <w:tc>
           <w:tcPr>
             <w:tcW w:type="dxa" w:w="2484"/>
@@ -11331,6 +11197,9 @@
         </w:tc>
       </w:tr>
       <w:tr>
+        <w:trPr>
+          <w:cantSplit/>
+        </w:trPr>
         <w:tc>
           <w:tcPr>
             <w:tcW w:type="dxa" w:w="2484"/>
@@ -11437,6 +11306,9 @@
         </w:tc>
       </w:tr>
       <w:tr>
+        <w:trPr>
+          <w:cantSplit/>
+        </w:trPr>
         <w:tc>
           <w:tcPr>
             <w:tcW w:type="dxa" w:w="2484"/>
@@ -11543,6 +11415,9 @@
         </w:tc>
       </w:tr>
       <w:tr>
+        <w:trPr>
+          <w:cantSplit/>
+        </w:trPr>
         <w:tc>
           <w:tcPr>
             <w:tcW w:type="dxa" w:w="2484"/>
@@ -11716,6 +11591,10 @@
         <w:gridCol w:w="9936"/>
       </w:tblGrid>
       <w:tr>
+        <w:trPr>
+          <w:cantSplit/>
+          <w:tblHeader/>
+        </w:trPr>
         <w:tc>
           <w:tcPr>
             <w:tcW w:type="dxa" w:w="9936"/>
@@ -11779,6 +11658,10 @@
         <w:gridCol w:w="9936"/>
       </w:tblGrid>
       <w:tr>
+        <w:trPr>
+          <w:cantSplit/>
+          <w:tblHeader/>
+        </w:trPr>
         <w:tc>
           <w:tcPr>
             <w:tcW w:type="dxa" w:w="9936"/>
@@ -11877,6 +11760,10 @@
         <w:gridCol w:w="1987"/>
       </w:tblGrid>
       <w:tr>
+        <w:trPr>
+          <w:cantSplit/>
+          <w:tblHeader/>
+        </w:trPr>
         <w:tc>
           <w:tcPr>
             <w:tcW w:type="dxa" w:w="1987"/>
@@ -12014,6 +11901,9 @@
         </w:tc>
       </w:tr>
       <w:tr>
+        <w:trPr>
+          <w:cantSplit/>
+        </w:trPr>
         <w:tc>
           <w:tcPr>
             <w:tcW w:type="dxa" w:w="1987"/>
@@ -12146,6 +12036,9 @@
         </w:tc>
       </w:tr>
       <w:tr>
+        <w:trPr>
+          <w:cantSplit/>
+        </w:trPr>
         <w:tc>
           <w:tcPr>
             <w:tcW w:type="dxa" w:w="1987"/>
@@ -12278,6 +12171,9 @@
         </w:tc>
       </w:tr>
       <w:tr>
+        <w:trPr>
+          <w:cantSplit/>
+        </w:trPr>
         <w:tc>
           <w:tcPr>
             <w:tcW w:type="dxa" w:w="1987"/>
@@ -12410,6 +12306,9 @@
         </w:tc>
       </w:tr>
       <w:tr>
+        <w:trPr>
+          <w:cantSplit/>
+        </w:trPr>
         <w:tc>
           <w:tcPr>
             <w:tcW w:type="dxa" w:w="1987"/>
@@ -12557,6 +12456,10 @@
         <w:gridCol w:w="9936"/>
       </w:tblGrid>
       <w:tr>
+        <w:trPr>
+          <w:cantSplit/>
+          <w:tblHeader/>
+        </w:trPr>
         <w:tc>
           <w:tcPr>
             <w:tcW w:type="dxa" w:w="9936"/>
@@ -12725,6 +12628,10 @@
         <w:gridCol w:w="9936"/>
       </w:tblGrid>
       <w:tr>
+        <w:trPr>
+          <w:cantSplit/>
+          <w:tblHeader/>
+        </w:trPr>
         <w:tc>
           <w:tcPr>
             <w:tcW w:type="dxa" w:w="9936"/>
@@ -12827,6 +12734,10 @@
         <w:gridCol w:w="9936"/>
       </w:tblGrid>
       <w:tr>
+        <w:trPr>
+          <w:cantSplit/>
+          <w:tblHeader/>
+        </w:trPr>
         <w:tc>
           <w:tcPr>
             <w:tcW w:type="dxa" w:w="9936"/>
@@ -13466,6 +13377,10 @@
         <w:gridCol w:w="9936"/>
       </w:tblGrid>
       <w:tr>
+        <w:trPr>
+          <w:cantSplit/>
+          <w:tblHeader/>
+        </w:trPr>
         <w:tc>
           <w:tcPr>
             <w:tcW w:type="dxa" w:w="9936"/>
@@ -13770,6 +13685,10 @@
         <w:gridCol w:w="9936"/>
       </w:tblGrid>
       <w:tr>
+        <w:trPr>
+          <w:cantSplit/>
+          <w:tblHeader/>
+        </w:trPr>
         <w:tc>
           <w:tcPr>
             <w:tcW w:type="dxa" w:w="9936"/>
@@ -13859,6 +13778,10 @@
         <w:gridCol w:w="9936"/>
       </w:tblGrid>
       <w:tr>
+        <w:trPr>
+          <w:cantSplit/>
+          <w:tblHeader/>
+        </w:trPr>
         <w:tc>
           <w:tcPr>
             <w:tcW w:type="dxa" w:w="9936"/>
@@ -13937,6 +13860,10 @@
         <w:gridCol w:w="9936"/>
       </w:tblGrid>
       <w:tr>
+        <w:trPr>
+          <w:cantSplit/>
+          <w:tblHeader/>
+        </w:trPr>
         <w:tc>
           <w:tcPr>
             <w:tcW w:type="dxa" w:w="9936"/>
@@ -14039,6 +13966,10 @@
         <w:gridCol w:w="9936"/>
       </w:tblGrid>
       <w:tr>
+        <w:trPr>
+          <w:cantSplit/>
+          <w:tblHeader/>
+        </w:trPr>
         <w:tc>
           <w:tcPr>
             <w:tcW w:type="dxa" w:w="9936"/>
@@ -14083,6 +14014,10 @@
         <w:gridCol w:w="9936"/>
       </w:tblGrid>
       <w:tr>
+        <w:trPr>
+          <w:cantSplit/>
+          <w:tblHeader/>
+        </w:trPr>
         <w:tc>
           <w:tcPr>
             <w:tcW w:type="dxa" w:w="9936"/>
@@ -14207,6 +14142,10 @@
         <w:gridCol w:w="9936"/>
       </w:tblGrid>
       <w:tr>
+        <w:trPr>
+          <w:cantSplit/>
+          <w:tblHeader/>
+        </w:trPr>
         <w:tc>
           <w:tcPr>
             <w:tcW w:type="dxa" w:w="9936"/>
@@ -14400,6 +14339,10 @@
         <w:gridCol w:w="9936"/>
       </w:tblGrid>
       <w:tr>
+        <w:trPr>
+          <w:cantSplit/>
+          <w:tblHeader/>
+        </w:trPr>
         <w:tc>
           <w:tcPr>
             <w:tcW w:type="dxa" w:w="9936"/>
@@ -14450,6 +14393,10 @@
         <w:gridCol w:w="9936"/>
       </w:tblGrid>
       <w:tr>
+        <w:trPr>
+          <w:cantSplit/>
+          <w:tblHeader/>
+        </w:trPr>
         <w:tc>
           <w:tcPr>
             <w:tcW w:type="dxa" w:w="9936"/>
@@ -14568,6 +14515,10 @@
         <w:gridCol w:w="2484"/>
       </w:tblGrid>
       <w:tr>
+        <w:trPr>
+          <w:cantSplit/>
+          <w:tblHeader/>
+        </w:trPr>
         <w:tc>
           <w:tcPr>
             <w:tcW w:type="dxa" w:w="2484"/>
@@ -14678,6 +14629,9 @@
         </w:tc>
       </w:tr>
       <w:tr>
+        <w:trPr>
+          <w:cantSplit/>
+        </w:trPr>
         <w:tc>
           <w:tcPr>
             <w:tcW w:type="dxa" w:w="2484"/>
@@ -14784,6 +14738,9 @@
         </w:tc>
       </w:tr>
       <w:tr>
+        <w:trPr>
+          <w:cantSplit/>
+        </w:trPr>
         <w:tc>
           <w:tcPr>
             <w:tcW w:type="dxa" w:w="2484"/>
@@ -14890,6 +14847,9 @@
         </w:tc>
       </w:tr>
       <w:tr>
+        <w:trPr>
+          <w:cantSplit/>
+        </w:trPr>
         <w:tc>
           <w:tcPr>
             <w:tcW w:type="dxa" w:w="2484"/>
@@ -14996,6 +14956,9 @@
         </w:tc>
       </w:tr>
       <w:tr>
+        <w:trPr>
+          <w:cantSplit/>
+        </w:trPr>
         <w:tc>
           <w:tcPr>
             <w:tcW w:type="dxa" w:w="2484"/>
@@ -15131,6 +15094,10 @@
         <w:gridCol w:w="9936"/>
       </w:tblGrid>
       <w:tr>
+        <w:trPr>
+          <w:cantSplit/>
+          <w:tblHeader/>
+        </w:trPr>
         <w:tc>
           <w:tcPr>
             <w:tcW w:type="dxa" w:w="9936"/>
@@ -15220,6 +15187,10 @@
         <w:gridCol w:w="9936"/>
       </w:tblGrid>
       <w:tr>
+        <w:trPr>
+          <w:cantSplit/>
+          <w:tblHeader/>
+        </w:trPr>
         <w:tc>
           <w:tcPr>
             <w:tcW w:type="dxa" w:w="9936"/>
@@ -15270,6 +15241,10 @@
         <w:gridCol w:w="9936"/>
       </w:tblGrid>
       <w:tr>
+        <w:trPr>
+          <w:cantSplit/>
+          <w:tblHeader/>
+        </w:trPr>
         <w:tc>
           <w:tcPr>
             <w:tcW w:type="dxa" w:w="9936"/>
@@ -15388,6 +15363,10 @@
         <w:gridCol w:w="2484"/>
       </w:tblGrid>
       <w:tr>
+        <w:trPr>
+          <w:cantSplit/>
+          <w:tblHeader/>
+        </w:trPr>
         <w:tc>
           <w:tcPr>
             <w:tcW w:type="dxa" w:w="2484"/>
@@ -15498,6 +15477,9 @@
         </w:tc>
       </w:tr>
       <w:tr>
+        <w:trPr>
+          <w:cantSplit/>
+        </w:trPr>
         <w:tc>
           <w:tcPr>
             <w:tcW w:type="dxa" w:w="2484"/>
@@ -15604,6 +15586,9 @@
         </w:tc>
       </w:tr>
       <w:tr>
+        <w:trPr>
+          <w:cantSplit/>
+        </w:trPr>
         <w:tc>
           <w:tcPr>
             <w:tcW w:type="dxa" w:w="2484"/>
@@ -15710,6 +15695,9 @@
         </w:tc>
       </w:tr>
       <w:tr>
+        <w:trPr>
+          <w:cantSplit/>
+        </w:trPr>
         <w:tc>
           <w:tcPr>
             <w:tcW w:type="dxa" w:w="2484"/>
@@ -15816,6 +15804,9 @@
         </w:tc>
       </w:tr>
       <w:tr>
+        <w:trPr>
+          <w:cantSplit/>
+        </w:trPr>
         <w:tc>
           <w:tcPr>
             <w:tcW w:type="dxa" w:w="2484"/>
@@ -15951,6 +15942,10 @@
         <w:gridCol w:w="9936"/>
       </w:tblGrid>
       <w:tr>
+        <w:trPr>
+          <w:cantSplit/>
+          <w:tblHeader/>
+        </w:trPr>
         <w:tc>
           <w:tcPr>
             <w:tcW w:type="dxa" w:w="9936"/>
@@ -16040,6 +16035,10 @@
         <w:gridCol w:w="9936"/>
       </w:tblGrid>
       <w:tr>
+        <w:trPr>
+          <w:cantSplit/>
+          <w:tblHeader/>
+        </w:trPr>
         <w:tc>
           <w:tcPr>
             <w:tcW w:type="dxa" w:w="9936"/>
@@ -16090,6 +16089,10 @@
         <w:gridCol w:w="9936"/>
       </w:tblGrid>
       <w:tr>
+        <w:trPr>
+          <w:cantSplit/>
+          <w:tblHeader/>
+        </w:trPr>
         <w:tc>
           <w:tcPr>
             <w:tcW w:type="dxa" w:w="9936"/>
@@ -16214,6 +16217,10 @@
         <w:gridCol w:w="9936"/>
       </w:tblGrid>
       <w:tr>
+        <w:trPr>
+          <w:cantSplit/>
+          <w:tblHeader/>
+        </w:trPr>
         <w:tc>
           <w:tcPr>
             <w:tcW w:type="dxa" w:w="9936"/>
@@ -16316,6 +16323,10 @@
         <w:gridCol w:w="9936"/>
       </w:tblGrid>
       <w:tr>
+        <w:trPr>
+          <w:cantSplit/>
+          <w:tblHeader/>
+        </w:trPr>
         <w:tc>
           <w:tcPr>
             <w:tcW w:type="dxa" w:w="9936"/>
@@ -16578,6 +16589,10 @@
         <w:gridCol w:w="9936"/>
       </w:tblGrid>
       <w:tr>
+        <w:trPr>
+          <w:cantSplit/>
+          <w:tblHeader/>
+        </w:trPr>
         <w:tc>
           <w:tcPr>
             <w:tcW w:type="dxa" w:w="9936"/>
@@ -16667,6 +16682,10 @@
         <w:gridCol w:w="9936"/>
       </w:tblGrid>
       <w:tr>
+        <w:trPr>
+          <w:cantSplit/>
+          <w:tblHeader/>
+        </w:trPr>
         <w:tc>
           <w:tcPr>
             <w:tcW w:type="dxa" w:w="9936"/>
@@ -16745,6 +16764,10 @@
         <w:gridCol w:w="9936"/>
       </w:tblGrid>
       <w:tr>
+        <w:trPr>
+          <w:cantSplit/>
+          <w:tblHeader/>
+        </w:trPr>
         <w:tc>
           <w:tcPr>
             <w:tcW w:type="dxa" w:w="9936"/>
@@ -16835,6 +16858,10 @@
         <w:gridCol w:w="2484"/>
       </w:tblGrid>
       <w:tr>
+        <w:trPr>
+          <w:cantSplit/>
+          <w:tblHeader/>
+        </w:trPr>
         <w:tc>
           <w:tcPr>
             <w:tcW w:type="dxa" w:w="2484"/>
@@ -16945,6 +16972,9 @@
         </w:tc>
       </w:tr>
       <w:tr>
+        <w:trPr>
+          <w:cantSplit/>
+        </w:trPr>
         <w:tc>
           <w:tcPr>
             <w:tcW w:type="dxa" w:w="2484"/>
@@ -17051,6 +17081,9 @@
         </w:tc>
       </w:tr>
       <w:tr>
+        <w:trPr>
+          <w:cantSplit/>
+        </w:trPr>
         <w:tc>
           <w:tcPr>
             <w:tcW w:type="dxa" w:w="2484"/>
@@ -17157,6 +17190,9 @@
         </w:tc>
       </w:tr>
       <w:tr>
+        <w:trPr>
+          <w:cantSplit/>
+        </w:trPr>
         <w:tc>
           <w:tcPr>
             <w:tcW w:type="dxa" w:w="2484"/>
@@ -17263,6 +17299,9 @@
         </w:tc>
       </w:tr>
       <w:tr>
+        <w:trPr>
+          <w:cantSplit/>
+        </w:trPr>
         <w:tc>
           <w:tcPr>
             <w:tcW w:type="dxa" w:w="2484"/>
@@ -17384,6 +17423,10 @@
         <w:gridCol w:w="9936"/>
       </w:tblGrid>
       <w:tr>
+        <w:trPr>
+          <w:cantSplit/>
+          <w:tblHeader/>
+        </w:trPr>
         <w:tc>
           <w:tcPr>
             <w:tcW w:type="dxa" w:w="9936"/>
@@ -17473,6 +17516,10 @@
         <w:gridCol w:w="9936"/>
       </w:tblGrid>
       <w:tr>
+        <w:trPr>
+          <w:cantSplit/>
+          <w:tblHeader/>
+        </w:trPr>
         <w:tc>
           <w:tcPr>
             <w:tcW w:type="dxa" w:w="9936"/>
@@ -17563,6 +17610,10 @@
         <w:gridCol w:w="2484"/>
       </w:tblGrid>
       <w:tr>
+        <w:trPr>
+          <w:cantSplit/>
+          <w:tblHeader/>
+        </w:trPr>
         <w:tc>
           <w:tcPr>
             <w:tcW w:type="dxa" w:w="2484"/>
@@ -17673,6 +17724,9 @@
         </w:tc>
       </w:tr>
       <w:tr>
+        <w:trPr>
+          <w:cantSplit/>
+        </w:trPr>
         <w:tc>
           <w:tcPr>
             <w:tcW w:type="dxa" w:w="2484"/>
@@ -17779,6 +17833,9 @@
         </w:tc>
       </w:tr>
       <w:tr>
+        <w:trPr>
+          <w:cantSplit/>
+        </w:trPr>
         <w:tc>
           <w:tcPr>
             <w:tcW w:type="dxa" w:w="2484"/>
@@ -17885,6 +17942,9 @@
         </w:tc>
       </w:tr>
       <w:tr>
+        <w:trPr>
+          <w:cantSplit/>
+        </w:trPr>
         <w:tc>
           <w:tcPr>
             <w:tcW w:type="dxa" w:w="2484"/>
@@ -18042,6 +18102,10 @@
         <w:gridCol w:w="9936"/>
       </w:tblGrid>
       <w:tr>
+        <w:trPr>
+          <w:cantSplit/>
+          <w:tblHeader/>
+        </w:trPr>
         <w:tc>
           <w:tcPr>
             <w:tcW w:type="dxa" w:w="9936"/>
@@ -18105,6 +18169,10 @@
         <w:gridCol w:w="9936"/>
       </w:tblGrid>
       <w:tr>
+        <w:trPr>
+          <w:cantSplit/>
+          <w:tblHeader/>
+        </w:trPr>
         <w:tc>
           <w:tcPr>
             <w:tcW w:type="dxa" w:w="9936"/>
@@ -18210,6 +18278,10 @@
         <w:gridCol w:w="1987"/>
       </w:tblGrid>
       <w:tr>
+        <w:trPr>
+          <w:cantSplit/>
+          <w:tblHeader/>
+        </w:trPr>
         <w:tc>
           <w:tcPr>
             <w:tcW w:type="dxa" w:w="1987"/>
@@ -18347,6 +18419,9 @@
         </w:tc>
       </w:tr>
       <w:tr>
+        <w:trPr>
+          <w:cantSplit/>
+        </w:trPr>
         <w:tc>
           <w:tcPr>
             <w:tcW w:type="dxa" w:w="1987"/>
@@ -18479,6 +18554,9 @@
         </w:tc>
       </w:tr>
       <w:tr>
+        <w:trPr>
+          <w:cantSplit/>
+        </w:trPr>
         <w:tc>
           <w:tcPr>
             <w:tcW w:type="dxa" w:w="1987"/>
@@ -18611,6 +18689,9 @@
         </w:tc>
       </w:tr>
       <w:tr>
+        <w:trPr>
+          <w:cantSplit/>
+        </w:trPr>
         <w:tc>
           <w:tcPr>
             <w:tcW w:type="dxa" w:w="1987"/>
@@ -18743,6 +18824,9 @@
         </w:tc>
       </w:tr>
       <w:tr>
+        <w:trPr>
+          <w:cantSplit/>
+        </w:trPr>
         <w:tc>
           <w:tcPr>
             <w:tcW w:type="dxa" w:w="1987"/>
@@ -18890,6 +18974,10 @@
         <w:gridCol w:w="9936"/>
       </w:tblGrid>
       <w:tr>
+        <w:trPr>
+          <w:cantSplit/>
+          <w:tblHeader/>
+        </w:trPr>
         <w:tc>
           <w:tcPr>
             <w:tcW w:type="dxa" w:w="9936"/>
@@ -19058,6 +19146,10 @@
         <w:gridCol w:w="9936"/>
       </w:tblGrid>
       <w:tr>
+        <w:trPr>
+          <w:cantSplit/>
+          <w:tblHeader/>
+        </w:trPr>
         <w:tc>
           <w:tcPr>
             <w:tcW w:type="dxa" w:w="9936"/>
@@ -19160,6 +19252,10 @@
         <w:gridCol w:w="9936"/>
       </w:tblGrid>
       <w:tr>
+        <w:trPr>
+          <w:cantSplit/>
+          <w:tblHeader/>
+        </w:trPr>
         <w:tc>
           <w:tcPr>
             <w:tcW w:type="dxa" w:w="9936"/>
@@ -19799,6 +19895,10 @@
         <w:gridCol w:w="9936"/>
       </w:tblGrid>
       <w:tr>
+        <w:trPr>
+          <w:cantSplit/>
+          <w:tblHeader/>
+        </w:trPr>
         <w:tc>
           <w:tcPr>
             <w:tcW w:type="dxa" w:w="9936"/>
@@ -20103,6 +20203,10 @@
         <w:gridCol w:w="9936"/>
       </w:tblGrid>
       <w:tr>
+        <w:trPr>
+          <w:cantSplit/>
+          <w:tblHeader/>
+        </w:trPr>
         <w:tc>
           <w:tcPr>
             <w:tcW w:type="dxa" w:w="9936"/>
@@ -20192,6 +20296,10 @@
         <w:gridCol w:w="9936"/>
       </w:tblGrid>
       <w:tr>
+        <w:trPr>
+          <w:cantSplit/>
+          <w:tblHeader/>
+        </w:trPr>
         <w:tc>
           <w:tcPr>
             <w:tcW w:type="dxa" w:w="9936"/>
@@ -20270,6 +20378,10 @@
         <w:gridCol w:w="9936"/>
       </w:tblGrid>
       <w:tr>
+        <w:trPr>
+          <w:cantSplit/>
+          <w:tblHeader/>
+        </w:trPr>
         <w:tc>
           <w:tcPr>
             <w:tcW w:type="dxa" w:w="9936"/>
@@ -20385,6 +20497,10 @@
         <w:gridCol w:w="9936"/>
       </w:tblGrid>
       <w:tr>
+        <w:trPr>
+          <w:cantSplit/>
+          <w:tblHeader/>
+        </w:trPr>
         <w:tc>
           <w:tcPr>
             <w:tcW w:type="dxa" w:w="9936"/>
@@ -20429,6 +20545,10 @@
         <w:gridCol w:w="9936"/>
       </w:tblGrid>
       <w:tr>
+        <w:trPr>
+          <w:cantSplit/>
+          <w:tblHeader/>
+        </w:trPr>
         <w:tc>
           <w:tcPr>
             <w:tcW w:type="dxa" w:w="9936"/>
@@ -20522,6 +20642,10 @@
         <w:gridCol w:w="9936"/>
       </w:tblGrid>
       <w:tr>
+        <w:trPr>
+          <w:cantSplit/>
+          <w:tblHeader/>
+        </w:trPr>
         <w:tc>
           <w:tcPr>
             <w:tcW w:type="dxa" w:w="9936"/>
@@ -20655,6 +20779,10 @@
         <w:gridCol w:w="9936"/>
       </w:tblGrid>
       <w:tr>
+        <w:trPr>
+          <w:cantSplit/>
+          <w:tblHeader/>
+        </w:trPr>
         <w:tc>
           <w:tcPr>
             <w:tcW w:type="dxa" w:w="9936"/>
@@ -21138,6 +21266,10 @@
         <w:gridCol w:w="3312"/>
       </w:tblGrid>
       <w:tr>
+        <w:trPr>
+          <w:cantSplit/>
+          <w:tblHeader/>
+        </w:trPr>
         <w:tc>
           <w:tcPr>
             <w:tcW w:type="dxa" w:w="3312"/>
@@ -21221,6 +21353,9 @@
         </w:tc>
       </w:tr>
       <w:tr>
+        <w:trPr>
+          <w:cantSplit/>
+        </w:trPr>
         <w:tc>
           <w:tcPr>
             <w:tcW w:type="dxa" w:w="3312"/>
@@ -21301,6 +21436,9 @@
         </w:tc>
       </w:tr>
       <w:tr>
+        <w:trPr>
+          <w:cantSplit/>
+        </w:trPr>
         <w:tc>
           <w:tcPr>
             <w:tcW w:type="dxa" w:w="3312"/>
@@ -21381,6 +21519,9 @@
         </w:tc>
       </w:tr>
       <w:tr>
+        <w:trPr>
+          <w:cantSplit/>
+        </w:trPr>
         <w:tc>
           <w:tcPr>
             <w:tcW w:type="dxa" w:w="3312"/>
@@ -21476,6 +21617,10 @@
         <w:gridCol w:w="9936"/>
       </w:tblGrid>
       <w:tr>
+        <w:trPr>
+          <w:cantSplit/>
+          <w:tblHeader/>
+        </w:trPr>
         <w:tc>
           <w:tcPr>
             <w:tcW w:type="dxa" w:w="9936"/>
@@ -21582,6 +21727,10 @@
         <w:gridCol w:w="1987"/>
       </w:tblGrid>
       <w:tr>
+        <w:trPr>
+          <w:cantSplit/>
+          <w:tblHeader/>
+        </w:trPr>
         <w:tc>
           <w:tcPr>
             <w:tcW w:type="dxa" w:w="1987"/>
@@ -21719,6 +21868,9 @@
         </w:tc>
       </w:tr>
       <w:tr>
+        <w:trPr>
+          <w:cantSplit/>
+        </w:trPr>
         <w:tc>
           <w:tcPr>
             <w:tcW w:type="dxa" w:w="1987"/>
@@ -21851,6 +22003,9 @@
         </w:tc>
       </w:tr>
       <w:tr>
+        <w:trPr>
+          <w:cantSplit/>
+        </w:trPr>
         <w:tc>
           <w:tcPr>
             <w:tcW w:type="dxa" w:w="1987"/>
@@ -21983,6 +22138,9 @@
         </w:tc>
       </w:tr>
       <w:tr>
+        <w:trPr>
+          <w:cantSplit/>
+        </w:trPr>
         <w:tc>
           <w:tcPr>
             <w:tcW w:type="dxa" w:w="1987"/>
@@ -22115,6 +22273,9 @@
         </w:tc>
       </w:tr>
       <w:tr>
+        <w:trPr>
+          <w:cantSplit/>
+        </w:trPr>
         <w:tc>
           <w:tcPr>
             <w:tcW w:type="dxa" w:w="1987"/>
@@ -22284,6 +22445,10 @@
         <w:gridCol w:w="9936"/>
       </w:tblGrid>
       <w:tr>
+        <w:trPr>
+          <w:cantSplit/>
+          <w:tblHeader/>
+        </w:trPr>
         <w:tc>
           <w:tcPr>
             <w:tcW w:type="dxa" w:w="9936"/>
@@ -22328,6 +22493,10 @@
         <w:gridCol w:w="9936"/>
       </w:tblGrid>
       <w:tr>
+        <w:trPr>
+          <w:cantSplit/>
+          <w:tblHeader/>
+        </w:trPr>
         <w:tc>
           <w:tcPr>
             <w:tcW w:type="dxa" w:w="9936"/>
@@ -22416,6 +22585,10 @@
         <w:gridCol w:w="4968"/>
       </w:tblGrid>
       <w:tr>
+        <w:trPr>
+          <w:cantSplit/>
+          <w:tblHeader/>
+        </w:trPr>
         <w:tc>
           <w:tcPr>
             <w:tcW w:type="dxa" w:w="4968"/>
@@ -22472,6 +22645,9 @@
         </w:tc>
       </w:tr>
       <w:tr>
+        <w:trPr>
+          <w:cantSplit/>
+        </w:trPr>
         <w:tc>
           <w:tcPr>
             <w:tcW w:type="dxa" w:w="4968"/>
@@ -22526,6 +22702,9 @@
         </w:tc>
       </w:tr>
       <w:tr>
+        <w:trPr>
+          <w:cantSplit/>
+        </w:trPr>
         <w:tc>
           <w:tcPr>
             <w:tcW w:type="dxa" w:w="4968"/>
@@ -22580,6 +22759,9 @@
         </w:tc>
       </w:tr>
       <w:tr>
+        <w:trPr>
+          <w:cantSplit/>
+        </w:trPr>
         <w:tc>
           <w:tcPr>
             <w:tcW w:type="dxa" w:w="4968"/>
@@ -22634,6 +22816,9 @@
         </w:tc>
       </w:tr>
       <w:tr>
+        <w:trPr>
+          <w:cantSplit/>
+        </w:trPr>
         <w:tc>
           <w:tcPr>
             <w:tcW w:type="dxa" w:w="4968"/>
@@ -22688,6 +22873,9 @@
         </w:tc>
       </w:tr>
       <w:tr>
+        <w:trPr>
+          <w:cantSplit/>
+        </w:trPr>
         <w:tc>
           <w:tcPr>
             <w:tcW w:type="dxa" w:w="4968"/>
@@ -22742,6 +22930,9 @@
         </w:tc>
       </w:tr>
       <w:tr>
+        <w:trPr>
+          <w:cantSplit/>
+        </w:trPr>
         <w:tc>
           <w:tcPr>
             <w:tcW w:type="dxa" w:w="4968"/>
@@ -22796,6 +22987,9 @@
         </w:tc>
       </w:tr>
       <w:tr>
+        <w:trPr>
+          <w:cantSplit/>
+        </w:trPr>
         <w:tc>
           <w:tcPr>
             <w:tcW w:type="dxa" w:w="4968"/>
@@ -22850,6 +23044,9 @@
         </w:tc>
       </w:tr>
       <w:tr>
+        <w:trPr>
+          <w:cantSplit/>
+        </w:trPr>
         <w:tc>
           <w:tcPr>
             <w:tcW w:type="dxa" w:w="4968"/>
@@ -22904,6 +23101,9 @@
         </w:tc>
       </w:tr>
       <w:tr>
+        <w:trPr>
+          <w:cantSplit/>
+        </w:trPr>
         <w:tc>
           <w:tcPr>
             <w:tcW w:type="dxa" w:w="4968"/>
@@ -22958,6 +23158,9 @@
         </w:tc>
       </w:tr>
       <w:tr>
+        <w:trPr>
+          <w:cantSplit/>
+        </w:trPr>
         <w:tc>
           <w:tcPr>
             <w:tcW w:type="dxa" w:w="4968"/>
@@ -23012,6 +23215,9 @@
         </w:tc>
       </w:tr>
       <w:tr>
+        <w:trPr>
+          <w:cantSplit/>
+        </w:trPr>
         <w:tc>
           <w:tcPr>
             <w:tcW w:type="dxa" w:w="4968"/>
@@ -23066,6 +23272,9 @@
         </w:tc>
       </w:tr>
       <w:tr>
+        <w:trPr>
+          <w:cantSplit/>
+        </w:trPr>
         <w:tc>
           <w:tcPr>
             <w:tcW w:type="dxa" w:w="4968"/>
@@ -23120,6 +23329,9 @@
         </w:tc>
       </w:tr>
       <w:tr>
+        <w:trPr>
+          <w:cantSplit/>
+        </w:trPr>
         <w:tc>
           <w:tcPr>
             <w:tcW w:type="dxa" w:w="4968"/>
@@ -23174,6 +23386,9 @@
         </w:tc>
       </w:tr>
       <w:tr>
+        <w:trPr>
+          <w:cantSplit/>
+        </w:trPr>
         <w:tc>
           <w:tcPr>
             <w:tcW w:type="dxa" w:w="4968"/>
@@ -23228,6 +23443,9 @@
         </w:tc>
       </w:tr>
       <w:tr>
+        <w:trPr>
+          <w:cantSplit/>
+        </w:trPr>
         <w:tc>
           <w:tcPr>
             <w:tcW w:type="dxa" w:w="4968"/>
@@ -23282,6 +23500,9 @@
         </w:tc>
       </w:tr>
       <w:tr>
+        <w:trPr>
+          <w:cantSplit/>
+        </w:trPr>
         <w:tc>
           <w:tcPr>
             <w:tcW w:type="dxa" w:w="4968"/>
@@ -23336,6 +23557,9 @@
         </w:tc>
       </w:tr>
       <w:tr>
+        <w:trPr>
+          <w:cantSplit/>
+        </w:trPr>
         <w:tc>
           <w:tcPr>
             <w:tcW w:type="dxa" w:w="4968"/>
@@ -23390,6 +23614,9 @@
         </w:tc>
       </w:tr>
       <w:tr>
+        <w:trPr>
+          <w:cantSplit/>
+        </w:trPr>
         <w:tc>
           <w:tcPr>
             <w:tcW w:type="dxa" w:w="4968"/>
@@ -23444,6 +23671,9 @@
         </w:tc>
       </w:tr>
       <w:tr>
+        <w:trPr>
+          <w:cantSplit/>
+        </w:trPr>
         <w:tc>
           <w:tcPr>
             <w:tcW w:type="dxa" w:w="4968"/>
@@ -23498,6 +23728,9 @@
         </w:tc>
       </w:tr>
       <w:tr>
+        <w:trPr>
+          <w:cantSplit/>
+        </w:trPr>
         <w:tc>
           <w:tcPr>
             <w:tcW w:type="dxa" w:w="4968"/>
@@ -23552,6 +23785,9 @@
         </w:tc>
       </w:tr>
       <w:tr>
+        <w:trPr>
+          <w:cantSplit/>
+        </w:trPr>
         <w:tc>
           <w:tcPr>
             <w:tcW w:type="dxa" w:w="4968"/>
@@ -23606,6 +23842,9 @@
         </w:tc>
       </w:tr>
       <w:tr>
+        <w:trPr>
+          <w:cantSplit/>
+        </w:trPr>
         <w:tc>
           <w:tcPr>
             <w:tcW w:type="dxa" w:w="4968"/>
@@ -23660,6 +23899,9 @@
         </w:tc>
       </w:tr>
       <w:tr>
+        <w:trPr>
+          <w:cantSplit/>
+        </w:trPr>
         <w:tc>
           <w:tcPr>
             <w:tcW w:type="dxa" w:w="4968"/>
@@ -23714,6 +23956,9 @@
         </w:tc>
       </w:tr>
       <w:tr>
+        <w:trPr>
+          <w:cantSplit/>
+        </w:trPr>
         <w:tc>
           <w:tcPr>
             <w:tcW w:type="dxa" w:w="4968"/>
@@ -23768,6 +24013,9 @@
         </w:tc>
       </w:tr>
       <w:tr>
+        <w:trPr>
+          <w:cantSplit/>
+        </w:trPr>
         <w:tc>
           <w:tcPr>
             <w:tcW w:type="dxa" w:w="4968"/>
@@ -23850,6 +24098,10 @@
         <w:gridCol w:w="9936"/>
       </w:tblGrid>
       <w:tr>
+        <w:trPr>
+          <w:cantSplit/>
+          <w:tblHeader/>
+        </w:trPr>
         <w:tc>
           <w:tcPr>
             <w:tcW w:type="dxa" w:w="9936"/>
@@ -23894,6 +24146,10 @@
         <w:gridCol w:w="9936"/>
       </w:tblGrid>
       <w:tr>
+        <w:trPr>
+          <w:cantSplit/>
+          <w:tblHeader/>
+        </w:trPr>
         <w:tc>
           <w:tcPr>
             <w:tcW w:type="dxa" w:w="9936"/>
@@ -23991,6 +24247,10 @@
         <w:gridCol w:w="903"/>
       </w:tblGrid>
       <w:tr>
+        <w:trPr>
+          <w:cantSplit/>
+          <w:tblHeader/>
+        </w:trPr>
         <w:tc>
           <w:tcPr>
             <w:tcW w:type="dxa" w:w="903"/>
@@ -24290,6 +24550,9 @@
         </w:tc>
       </w:tr>
       <w:tr>
+        <w:trPr>
+          <w:cantSplit/>
+        </w:trPr>
         <w:tc>
           <w:tcPr>
             <w:tcW w:type="dxa" w:w="903"/>
@@ -24616,6 +24879,10 @@
         <w:gridCol w:w="4968"/>
       </w:tblGrid>
       <w:tr>
+        <w:trPr>
+          <w:cantSplit/>
+          <w:tblHeader/>
+        </w:trPr>
         <w:tc>
           <w:tcPr>
             <w:tcW w:type="dxa" w:w="4968"/>
@@ -24672,6 +24939,9 @@
         </w:tc>
       </w:tr>
       <w:tr>
+        <w:trPr>
+          <w:cantSplit/>
+        </w:trPr>
         <w:tc>
           <w:tcPr>
             <w:tcW w:type="dxa" w:w="4968"/>
@@ -24726,6 +24996,9 @@
         </w:tc>
       </w:tr>
       <w:tr>
+        <w:trPr>
+          <w:cantSplit/>
+        </w:trPr>
         <w:tc>
           <w:tcPr>
             <w:tcW w:type="dxa" w:w="4968"/>
@@ -24780,6 +25053,9 @@
         </w:tc>
       </w:tr>
       <w:tr>
+        <w:trPr>
+          <w:cantSplit/>
+        </w:trPr>
         <w:tc>
           <w:tcPr>
             <w:tcW w:type="dxa" w:w="4968"/>
@@ -24834,6 +25110,9 @@
         </w:tc>
       </w:tr>
       <w:tr>
+        <w:trPr>
+          <w:cantSplit/>
+        </w:trPr>
         <w:tc>
           <w:tcPr>
             <w:tcW w:type="dxa" w:w="4968"/>
@@ -24888,6 +25167,9 @@
         </w:tc>
       </w:tr>
       <w:tr>
+        <w:trPr>
+          <w:cantSplit/>
+        </w:trPr>
         <w:tc>
           <w:tcPr>
             <w:tcW w:type="dxa" w:w="4968"/>
@@ -25004,6 +25286,10 @@
         <w:gridCol w:w="903"/>
       </w:tblGrid>
       <w:tr>
+        <w:trPr>
+          <w:cantSplit/>
+          <w:tblHeader/>
+        </w:trPr>
         <w:tc>
           <w:tcPr>
             <w:tcW w:type="dxa" w:w="903"/>
@@ -25303,6 +25589,9 @@
         </w:tc>
       </w:tr>
       <w:tr>
+        <w:trPr>
+          <w:cantSplit/>
+        </w:trPr>
         <w:tc>
           <w:tcPr>
             <w:tcW w:type="dxa" w:w="903"/>
@@ -25629,6 +25918,10 @@
         <w:gridCol w:w="4968"/>
       </w:tblGrid>
       <w:tr>
+        <w:trPr>
+          <w:cantSplit/>
+          <w:tblHeader/>
+        </w:trPr>
         <w:tc>
           <w:tcPr>
             <w:tcW w:type="dxa" w:w="4968"/>
@@ -25685,6 +25978,9 @@
         </w:tc>
       </w:tr>
       <w:tr>
+        <w:trPr>
+          <w:cantSplit/>
+        </w:trPr>
         <w:tc>
           <w:tcPr>
             <w:tcW w:type="dxa" w:w="4968"/>
@@ -25739,6 +26035,9 @@
         </w:tc>
       </w:tr>
       <w:tr>
+        <w:trPr>
+          <w:cantSplit/>
+        </w:trPr>
         <w:tc>
           <w:tcPr>
             <w:tcW w:type="dxa" w:w="4968"/>
@@ -25793,6 +26092,9 @@
         </w:tc>
       </w:tr>
       <w:tr>
+        <w:trPr>
+          <w:cantSplit/>
+        </w:trPr>
         <w:tc>
           <w:tcPr>
             <w:tcW w:type="dxa" w:w="4968"/>
@@ -25847,6 +26149,9 @@
         </w:tc>
       </w:tr>
       <w:tr>
+        <w:trPr>
+          <w:cantSplit/>
+        </w:trPr>
         <w:tc>
           <w:tcPr>
             <w:tcW w:type="dxa" w:w="4968"/>
@@ -25901,6 +26206,9 @@
         </w:tc>
       </w:tr>
       <w:tr>
+        <w:trPr>
+          <w:cantSplit/>
+        </w:trPr>
         <w:tc>
           <w:tcPr>
             <w:tcW w:type="dxa" w:w="4968"/>
@@ -26017,6 +26325,10 @@
         <w:gridCol w:w="903"/>
       </w:tblGrid>
       <w:tr>
+        <w:trPr>
+          <w:cantSplit/>
+          <w:tblHeader/>
+        </w:trPr>
         <w:tc>
           <w:tcPr>
             <w:tcW w:type="dxa" w:w="903"/>
@@ -26316,6 +26628,9 @@
         </w:tc>
       </w:tr>
       <w:tr>
+        <w:trPr>
+          <w:cantSplit/>
+        </w:trPr>
         <w:tc>
           <w:tcPr>
             <w:tcW w:type="dxa" w:w="903"/>
@@ -26642,6 +26957,10 @@
         <w:gridCol w:w="4968"/>
       </w:tblGrid>
       <w:tr>
+        <w:trPr>
+          <w:cantSplit/>
+          <w:tblHeader/>
+        </w:trPr>
         <w:tc>
           <w:tcPr>
             <w:tcW w:type="dxa" w:w="4968"/>
@@ -26698,6 +27017,9 @@
         </w:tc>
       </w:tr>
       <w:tr>
+        <w:trPr>
+          <w:cantSplit/>
+        </w:trPr>
         <w:tc>
           <w:tcPr>
             <w:tcW w:type="dxa" w:w="4968"/>
@@ -26752,6 +27074,9 @@
         </w:tc>
       </w:tr>
       <w:tr>
+        <w:trPr>
+          <w:cantSplit/>
+        </w:trPr>
         <w:tc>
           <w:tcPr>
             <w:tcW w:type="dxa" w:w="4968"/>
@@ -26806,6 +27131,9 @@
         </w:tc>
       </w:tr>
       <w:tr>
+        <w:trPr>
+          <w:cantSplit/>
+        </w:trPr>
         <w:tc>
           <w:tcPr>
             <w:tcW w:type="dxa" w:w="4968"/>
@@ -26860,6 +27188,9 @@
         </w:tc>
       </w:tr>
       <w:tr>
+        <w:trPr>
+          <w:cantSplit/>
+        </w:trPr>
         <w:tc>
           <w:tcPr>
             <w:tcW w:type="dxa" w:w="4968"/>
@@ -26914,6 +27245,9 @@
         </w:tc>
       </w:tr>
       <w:tr>
+        <w:trPr>
+          <w:cantSplit/>
+        </w:trPr>
         <w:tc>
           <w:tcPr>
             <w:tcW w:type="dxa" w:w="4968"/>
@@ -27021,6 +27355,10 @@
         <w:gridCol w:w="4968"/>
       </w:tblGrid>
       <w:tr>
+        <w:trPr>
+          <w:cantSplit/>
+          <w:tblHeader/>
+        </w:trPr>
         <w:tc>
           <w:tcPr>
             <w:tcW w:type="dxa" w:w="4968"/>
@@ -27077,6 +27415,9 @@
         </w:tc>
       </w:tr>
       <w:tr>
+        <w:trPr>
+          <w:cantSplit/>
+        </w:trPr>
         <w:tc>
           <w:tcPr>
             <w:tcW w:type="dxa" w:w="4968"/>
@@ -27131,6 +27472,9 @@
         </w:tc>
       </w:tr>
       <w:tr>
+        <w:trPr>
+          <w:cantSplit/>
+        </w:trPr>
         <w:tc>
           <w:tcPr>
             <w:tcW w:type="dxa" w:w="4968"/>
@@ -27185,6 +27529,9 @@
         </w:tc>
       </w:tr>
       <w:tr>
+        <w:trPr>
+          <w:cantSplit/>
+        </w:trPr>
         <w:tc>
           <w:tcPr>
             <w:tcW w:type="dxa" w:w="4968"/>
@@ -27239,6 +27586,9 @@
         </w:tc>
       </w:tr>
       <w:tr>
+        <w:trPr>
+          <w:cantSplit/>
+        </w:trPr>
         <w:tc>
           <w:tcPr>
             <w:tcW w:type="dxa" w:w="4968"/>
@@ -27293,6 +27643,9 @@
         </w:tc>
       </w:tr>
       <w:tr>
+        <w:trPr>
+          <w:cantSplit/>
+        </w:trPr>
         <w:tc>
           <w:tcPr>
             <w:tcW w:type="dxa" w:w="4968"/>
@@ -27389,6 +27742,10 @@
         <w:gridCol w:w="1656"/>
       </w:tblGrid>
       <w:tr>
+        <w:trPr>
+          <w:cantSplit/>
+          <w:tblHeader/>
+        </w:trPr>
         <w:tc>
           <w:tcPr>
             <w:tcW w:type="dxa" w:w="1656"/>
@@ -27553,6 +27910,9 @@
         </w:tc>
       </w:tr>
       <w:tr>
+        <w:trPr>
+          <w:cantSplit/>
+        </w:trPr>
         <w:tc>
           <w:tcPr>
             <w:tcW w:type="dxa" w:w="1656"/>
@@ -27740,6 +28100,10 @@
         <w:gridCol w:w="9936"/>
       </w:tblGrid>
       <w:tr>
+        <w:trPr>
+          <w:cantSplit/>
+          <w:tblHeader/>
+        </w:trPr>
         <w:tc>
           <w:tcPr>
             <w:tcW w:type="dxa" w:w="9936"/>
@@ -27819,6 +28183,840 @@
         <w:spacing w:after="40"/>
       </w:pPr>
     </w:p>
+    <w:p>
+      <w:r>
+        <w:br w:type="page"/>
+      </w:r>
+    </w:p>
+    <w:tbl>
+      <w:tblPr>
+        <w:tblW w:type="auto" w:w="0"/>
+        <w:jc w:val="center"/>
+        <w:tblLook w:firstColumn="1" w:firstRow="1" w:lastColumn="0" w:lastRow="0" w:noHBand="0" w:noVBand="1" w:val="04A0"/>
+        <w:tblBorders>
+          <w:top w:val="none"/>
+          <w:left w:val="none"/>
+          <w:bottom w:val="none"/>
+          <w:right w:val="none"/>
+          <w:insideH w:val="none"/>
+          <w:insideV w:val="none"/>
+        </w:tblBorders>
+      </w:tblPr>
+      <w:tblGrid>
+        <w:gridCol w:w="9936"/>
+      </w:tblGrid>
+      <w:tr>
+        <w:trPr>
+          <w:cantSplit/>
+          <w:tblHeader/>
+        </w:trPr>
+        <w:tc>
+          <w:tcPr>
+            <w:tcW w:type="dxa" w:w="9936"/>
+            <w:shd w:fill="1B365D"/>
+            <w:tcMar>
+              <w:top w:w="100" w:type="dxa"/>
+              <w:bottom w:w="100" w:type="dxa"/>
+              <w:left w:w="150" w:type="dxa"/>
+              <w:right w:w="150" w:type="dxa"/>
+            </w:tcMar>
+          </w:tcPr>
+          <w:p>
+            <w:pPr>
+              <w:spacing w:before="40" w:after="40" w:line="276" w:lineRule="auto"/>
+              <w:jc w:val="center"/>
+            </w:pPr>
+            <w:r>
+              <w:rPr>
+                <w:rFonts w:ascii="Cambria" w:hAnsi="Cambria"/>
+                <w:b/>
+                <w:color w:val="FFFFFF"/>
+                <w:sz w:val="27"/>
+              </w:rPr>
+              <w:t>DEPED MATATAG QUALITY ASSURANCE AUDIT CERTIFICATE</w:t>
+            </w:r>
+          </w:p>
+        </w:tc>
+      </w:tr>
+    </w:tbl>
+    <w:p>
+      <w:pPr>
+        <w:spacing w:after="80"/>
+      </w:pPr>
+    </w:p>
+    <w:tbl>
+      <w:tblPr>
+        <w:tblW w:type="auto" w:w="0"/>
+        <w:jc w:val="center"/>
+        <w:tblLook w:firstColumn="1" w:firstRow="1" w:lastColumn="0" w:lastRow="0" w:noHBand="0" w:noVBand="1" w:val="04A0"/>
+        <w:tblBorders>
+          <w:top w:val="single" w:sz="6" w:space="0" w:color="1B365D"/>
+          <w:left w:val="single" w:sz="6" w:space="0" w:color="1B365D"/>
+          <w:bottom w:val="single" w:sz="6" w:space="0" w:color="1B365D"/>
+          <w:right w:val="single" w:sz="6" w:space="0" w:color="1B365D"/>
+          <w:insideH w:val="single" w:sz="6" w:space="0" w:color="1B365D"/>
+          <w:insideV w:val="single" w:sz="6" w:space="0" w:color="1B365D"/>
+        </w:tblBorders>
+      </w:tblPr>
+      <w:tblGrid>
+        <w:gridCol w:w="2484"/>
+        <w:gridCol w:w="2484"/>
+        <w:gridCol w:w="2484"/>
+        <w:gridCol w:w="2484"/>
+      </w:tblGrid>
+      <w:tr>
+        <w:trPr>
+          <w:cantSplit/>
+          <w:tblHeader/>
+        </w:trPr>
+        <w:tc>
+          <w:tcPr>
+            <w:tcW w:type="dxa" w:w="2484"/>
+            <w:shd w:fill="1B365D"/>
+            <w:tcMar>
+              <w:top w:w="100" w:type="dxa"/>
+              <w:bottom w:w="100" w:type="dxa"/>
+              <w:left w:w="140" w:type="dxa"/>
+              <w:right w:w="140" w:type="dxa"/>
+            </w:tcMar>
+          </w:tcPr>
+          <w:p>
+            <w:pPr>
+              <w:spacing w:before="0" w:after="80" w:line="276" w:lineRule="auto"/>
+              <w:jc w:val="center"/>
+            </w:pPr>
+            <w:r>
+              <w:rPr>
+                <w:rFonts w:ascii="Arial" w:hAnsi="Arial"/>
+                <w:b/>
+                <w:color w:val="FFFFFF"/>
+                <w:sz w:val="19"/>
+              </w:rPr>
+              <w:t>Dimensiyon ng Pagsusuri (QA Dimension)</w:t>
+            </w:r>
+          </w:p>
+        </w:tc>
+        <w:tc>
+          <w:tcPr>
+            <w:tcW w:type="dxa" w:w="2484"/>
+            <w:shd w:fill="1B365D"/>
+            <w:tcMar>
+              <w:top w:w="100" w:type="dxa"/>
+              <w:bottom w:w="100" w:type="dxa"/>
+              <w:left w:w="140" w:type="dxa"/>
+              <w:right w:w="140" w:type="dxa"/>
+            </w:tcMar>
+          </w:tcPr>
+          <w:p>
+            <w:pPr>
+              <w:spacing w:before="0" w:after="80" w:line="276" w:lineRule="auto"/>
+              <w:jc w:val="center"/>
+            </w:pPr>
+            <w:r>
+              <w:rPr>
+                <w:rFonts w:ascii="Arial" w:hAnsi="Arial"/>
+                <w:b/>
+                <w:color w:val="FFFFFF"/>
+                <w:sz w:val="19"/>
+              </w:rPr>
+              <w:t>Pamantayan sa Pagsusuri (Criteria)</w:t>
+            </w:r>
+          </w:p>
+        </w:tc>
+        <w:tc>
+          <w:tcPr>
+            <w:tcW w:type="dxa" w:w="2484"/>
+            <w:shd w:fill="1B365D"/>
+            <w:tcMar>
+              <w:top w:w="100" w:type="dxa"/>
+              <w:bottom w:w="100" w:type="dxa"/>
+              <w:left w:w="140" w:type="dxa"/>
+              <w:right w:w="140" w:type="dxa"/>
+            </w:tcMar>
+          </w:tcPr>
+          <w:p>
+            <w:pPr>
+              <w:spacing w:before="0" w:after="80" w:line="276" w:lineRule="auto"/>
+              <w:jc w:val="center"/>
+            </w:pPr>
+            <w:r>
+              <w:rPr>
+                <w:rFonts w:ascii="Arial" w:hAnsi="Arial"/>
+                <w:b/>
+                <w:color w:val="FFFFFF"/>
+                <w:sz w:val="19"/>
+              </w:rPr>
+              <w:t>Puntos (Max)</w:t>
+            </w:r>
+          </w:p>
+        </w:tc>
+        <w:tc>
+          <w:tcPr>
+            <w:tcW w:type="dxa" w:w="2484"/>
+            <w:shd w:fill="1B365D"/>
+            <w:tcMar>
+              <w:top w:w="100" w:type="dxa"/>
+              <w:bottom w:w="100" w:type="dxa"/>
+              <w:left w:w="140" w:type="dxa"/>
+              <w:right w:w="140" w:type="dxa"/>
+            </w:tcMar>
+          </w:tcPr>
+          <w:p>
+            <w:pPr>
+              <w:spacing w:before="0" w:after="80" w:line="276" w:lineRule="auto"/>
+              <w:jc w:val="center"/>
+            </w:pPr>
+            <w:r>
+              <w:rPr>
+                <w:rFonts w:ascii="Arial" w:hAnsi="Arial"/>
+                <w:b/>
+                <w:color w:val="FFFFFF"/>
+                <w:sz w:val="19"/>
+              </w:rPr>
+              <w:t>Katayuan (Status)</w:t>
+            </w:r>
+          </w:p>
+        </w:tc>
+      </w:tr>
+      <w:tr>
+        <w:trPr>
+          <w:cantSplit/>
+        </w:trPr>
+        <w:tc>
+          <w:tcPr>
+            <w:tcW w:type="dxa" w:w="2484"/>
+            <w:tcMar>
+              <w:top w:w="80" w:type="dxa"/>
+              <w:bottom w:w="80" w:type="dxa"/>
+              <w:left w:w="120" w:type="dxa"/>
+              <w:right w:w="120" w:type="dxa"/>
+            </w:tcMar>
+          </w:tcPr>
+          <w:p>
+            <w:pPr>
+              <w:spacing w:before="0" w:after="80" w:line="276" w:lineRule="auto"/>
+              <w:jc w:val="left"/>
+            </w:pPr>
+            <w:r>
+              <w:rPr>
+                <w:rFonts w:ascii="Cambria" w:hAnsi="Cambria"/>
+                <w:b/>
+                <w:sz w:val="18"/>
+              </w:rPr>
+              <w:t>1. Pagkakahanay sa MATATAG</w:t>
+            </w:r>
+          </w:p>
+        </w:tc>
+        <w:tc>
+          <w:tcPr>
+            <w:tcW w:type="dxa" w:w="2484"/>
+            <w:tcMar>
+              <w:top w:w="80" w:type="dxa"/>
+              <w:bottom w:w="80" w:type="dxa"/>
+              <w:left w:w="120" w:type="dxa"/>
+              <w:right w:w="120" w:type="dxa"/>
+            </w:tcMar>
+          </w:tcPr>
+          <w:p>
+            <w:pPr>
+              <w:spacing w:before="0" w:after="80" w:line="276" w:lineRule="auto"/>
+              <w:jc w:val="left"/>
+            </w:pPr>
+            <w:r>
+              <w:rPr>
+                <w:rFonts w:ascii="Cambria" w:hAnsi="Cambria"/>
+                <w:sz w:val="18"/>
+              </w:rPr>
+              <w:t>Kumpletong koda ng kasanayan, 3 Mahahalagang Tanong, 70/30 ratio.</w:t>
+            </w:r>
+          </w:p>
+        </w:tc>
+        <w:tc>
+          <w:tcPr>
+            <w:tcW w:type="dxa" w:w="2484"/>
+            <w:tcMar>
+              <w:top w:w="80" w:type="dxa"/>
+              <w:bottom w:w="80" w:type="dxa"/>
+              <w:left w:w="120" w:type="dxa"/>
+              <w:right w:w="120" w:type="dxa"/>
+            </w:tcMar>
+          </w:tcPr>
+          <w:p>
+            <w:pPr>
+              <w:spacing w:before="0" w:after="80" w:line="276" w:lineRule="auto"/>
+              <w:jc w:val="center"/>
+            </w:pPr>
+            <w:r>
+              <w:rPr>
+                <w:rFonts w:ascii="Cambria" w:hAnsi="Cambria"/>
+                <w:sz w:val="18"/>
+              </w:rPr>
+              <w:t>20 / 20</w:t>
+            </w:r>
+          </w:p>
+        </w:tc>
+        <w:tc>
+          <w:tcPr>
+            <w:tcW w:type="dxa" w:w="2484"/>
+            <w:tcMar>
+              <w:top w:w="80" w:type="dxa"/>
+              <w:bottom w:w="80" w:type="dxa"/>
+              <w:left w:w="120" w:type="dxa"/>
+              <w:right w:w="120" w:type="dxa"/>
+            </w:tcMar>
+          </w:tcPr>
+          <w:p>
+            <w:pPr>
+              <w:spacing w:before="0" w:after="80" w:line="276" w:lineRule="auto"/>
+              <w:jc w:val="center"/>
+            </w:pPr>
+            <w:r>
+              <w:rPr>
+                <w:rFonts w:ascii="Cambria" w:hAnsi="Cambria"/>
+                <w:b/>
+                <w:color w:val="1E7E34"/>
+                <w:sz w:val="18"/>
+              </w:rPr>
+              <w:t>PASADO (100%)</w:t>
+            </w:r>
+          </w:p>
+        </w:tc>
+      </w:tr>
+      <w:tr>
+        <w:trPr>
+          <w:cantSplit/>
+        </w:trPr>
+        <w:tc>
+          <w:tcPr>
+            <w:tcW w:type="dxa" w:w="2484"/>
+            <w:shd w:fill="F8FAFC"/>
+            <w:tcMar>
+              <w:top w:w="80" w:type="dxa"/>
+              <w:bottom w:w="80" w:type="dxa"/>
+              <w:left w:w="120" w:type="dxa"/>
+              <w:right w:w="120" w:type="dxa"/>
+            </w:tcMar>
+          </w:tcPr>
+          <w:p>
+            <w:pPr>
+              <w:spacing w:before="0" w:after="80" w:line="276" w:lineRule="auto"/>
+              <w:jc w:val="left"/>
+            </w:pPr>
+            <w:r>
+              <w:rPr>
+                <w:rFonts w:ascii="Cambria" w:hAnsi="Cambria"/>
+                <w:b/>
+                <w:sz w:val="18"/>
+              </w:rPr>
+              <w:t>2. Kaangkupan sa Baitang 7</w:t>
+            </w:r>
+          </w:p>
+        </w:tc>
+        <w:tc>
+          <w:tcPr>
+            <w:tcW w:type="dxa" w:w="2484"/>
+            <w:shd w:fill="F8FAFC"/>
+            <w:tcMar>
+              <w:top w:w="80" w:type="dxa"/>
+              <w:bottom w:w="80" w:type="dxa"/>
+              <w:left w:w="120" w:type="dxa"/>
+              <w:right w:w="120" w:type="dxa"/>
+            </w:tcMar>
+          </w:tcPr>
+          <w:p>
+            <w:pPr>
+              <w:spacing w:before="0" w:after="80" w:line="276" w:lineRule="auto"/>
+              <w:jc w:val="left"/>
+            </w:pPr>
+            <w:r>
+              <w:rPr>
+                <w:rFonts w:ascii="Cambria" w:hAnsi="Cambria"/>
+                <w:sz w:val="18"/>
+              </w:rPr>
+              <w:t>DOK 1-2 kognitibong antas, angkop na bokabularyo, gender-fair language.</w:t>
+            </w:r>
+          </w:p>
+        </w:tc>
+        <w:tc>
+          <w:tcPr>
+            <w:tcW w:type="dxa" w:w="2484"/>
+            <w:shd w:fill="F8FAFC"/>
+            <w:tcMar>
+              <w:top w:w="80" w:type="dxa"/>
+              <w:bottom w:w="80" w:type="dxa"/>
+              <w:left w:w="120" w:type="dxa"/>
+              <w:right w:w="120" w:type="dxa"/>
+            </w:tcMar>
+          </w:tcPr>
+          <w:p>
+            <w:pPr>
+              <w:spacing w:before="0" w:after="80" w:line="276" w:lineRule="auto"/>
+              <w:jc w:val="center"/>
+            </w:pPr>
+            <w:r>
+              <w:rPr>
+                <w:rFonts w:ascii="Cambria" w:hAnsi="Cambria"/>
+                <w:sz w:val="18"/>
+              </w:rPr>
+              <w:t>20 / 20</w:t>
+            </w:r>
+          </w:p>
+        </w:tc>
+        <w:tc>
+          <w:tcPr>
+            <w:tcW w:type="dxa" w:w="2484"/>
+            <w:shd w:fill="F8FAFC"/>
+            <w:tcMar>
+              <w:top w:w="80" w:type="dxa"/>
+              <w:bottom w:w="80" w:type="dxa"/>
+              <w:left w:w="120" w:type="dxa"/>
+              <w:right w:w="120" w:type="dxa"/>
+            </w:tcMar>
+          </w:tcPr>
+          <w:p>
+            <w:pPr>
+              <w:spacing w:before="0" w:after="80" w:line="276" w:lineRule="auto"/>
+              <w:jc w:val="center"/>
+            </w:pPr>
+            <w:r>
+              <w:rPr>
+                <w:rFonts w:ascii="Cambria" w:hAnsi="Cambria"/>
+                <w:b/>
+                <w:color w:val="1E7E34"/>
+                <w:sz w:val="18"/>
+              </w:rPr>
+              <w:t>PASADO (100%)</w:t>
+            </w:r>
+          </w:p>
+        </w:tc>
+      </w:tr>
+      <w:tr>
+        <w:trPr>
+          <w:cantSplit/>
+        </w:trPr>
+        <w:tc>
+          <w:tcPr>
+            <w:tcW w:type="dxa" w:w="2484"/>
+            <w:tcMar>
+              <w:top w:w="80" w:type="dxa"/>
+              <w:bottom w:w="80" w:type="dxa"/>
+              <w:left w:w="120" w:type="dxa"/>
+              <w:right w:w="120" w:type="dxa"/>
+            </w:tcMar>
+          </w:tcPr>
+          <w:p>
+            <w:pPr>
+              <w:spacing w:before="0" w:after="80" w:line="276" w:lineRule="auto"/>
+              <w:jc w:val="left"/>
+            </w:pPr>
+            <w:r>
+              <w:rPr>
+                <w:rFonts w:ascii="Cambria" w:hAnsi="Cambria"/>
+                <w:b/>
+                <w:sz w:val="18"/>
+              </w:rPr>
+              <w:t>3. Katumpakang Pangkasaysayan</w:t>
+            </w:r>
+          </w:p>
+        </w:tc>
+        <w:tc>
+          <w:tcPr>
+            <w:tcW w:type="dxa" w:w="2484"/>
+            <w:tcMar>
+              <w:top w:w="80" w:type="dxa"/>
+              <w:bottom w:w="80" w:type="dxa"/>
+              <w:left w:w="120" w:type="dxa"/>
+              <w:right w:w="120" w:type="dxa"/>
+            </w:tcMar>
+          </w:tcPr>
+          <w:p>
+            <w:pPr>
+              <w:spacing w:before="0" w:after="80" w:line="276" w:lineRule="auto"/>
+              <w:jc w:val="left"/>
+            </w:pPr>
+            <w:r>
+              <w:rPr>
+                <w:rFonts w:ascii="Cambria" w:hAnsi="Cambria"/>
+                <w:sz w:val="18"/>
+              </w:rPr>
+              <w:t>Zero hallucination; totoong petsa, batis, at walang inimbentong batas.</w:t>
+            </w:r>
+          </w:p>
+        </w:tc>
+        <w:tc>
+          <w:tcPr>
+            <w:tcW w:type="dxa" w:w="2484"/>
+            <w:tcMar>
+              <w:top w:w="80" w:type="dxa"/>
+              <w:bottom w:w="80" w:type="dxa"/>
+              <w:left w:w="120" w:type="dxa"/>
+              <w:right w:w="120" w:type="dxa"/>
+            </w:tcMar>
+          </w:tcPr>
+          <w:p>
+            <w:pPr>
+              <w:spacing w:before="0" w:after="80" w:line="276" w:lineRule="auto"/>
+              <w:jc w:val="center"/>
+            </w:pPr>
+            <w:r>
+              <w:rPr>
+                <w:rFonts w:ascii="Cambria" w:hAnsi="Cambria"/>
+                <w:sz w:val="18"/>
+              </w:rPr>
+              <w:t>20 / 20</w:t>
+            </w:r>
+          </w:p>
+        </w:tc>
+        <w:tc>
+          <w:tcPr>
+            <w:tcW w:type="dxa" w:w="2484"/>
+            <w:tcMar>
+              <w:top w:w="80" w:type="dxa"/>
+              <w:bottom w:w="80" w:type="dxa"/>
+              <w:left w:w="120" w:type="dxa"/>
+              <w:right w:w="120" w:type="dxa"/>
+            </w:tcMar>
+          </w:tcPr>
+          <w:p>
+            <w:pPr>
+              <w:spacing w:before="0" w:after="80" w:line="276" w:lineRule="auto"/>
+              <w:jc w:val="center"/>
+            </w:pPr>
+            <w:r>
+              <w:rPr>
+                <w:rFonts w:ascii="Cambria" w:hAnsi="Cambria"/>
+                <w:b/>
+                <w:color w:val="1E7E34"/>
+                <w:sz w:val="18"/>
+              </w:rPr>
+              <w:t>PASADO (100%)</w:t>
+            </w:r>
+          </w:p>
+        </w:tc>
+      </w:tr>
+      <w:tr>
+        <w:trPr>
+          <w:cantSplit/>
+        </w:trPr>
+        <w:tc>
+          <w:tcPr>
+            <w:tcW w:type="dxa" w:w="2484"/>
+            <w:shd w:fill="F8FAFC"/>
+            <w:tcMar>
+              <w:top w:w="80" w:type="dxa"/>
+              <w:bottom w:w="80" w:type="dxa"/>
+              <w:left w:w="120" w:type="dxa"/>
+              <w:right w:w="120" w:type="dxa"/>
+            </w:tcMar>
+          </w:tcPr>
+          <w:p>
+            <w:pPr>
+              <w:spacing w:before="0" w:after="80" w:line="276" w:lineRule="auto"/>
+              <w:jc w:val="left"/>
+            </w:pPr>
+            <w:r>
+              <w:rPr>
+                <w:rFonts w:ascii="Cambria" w:hAnsi="Cambria"/>
+                <w:b/>
+                <w:sz w:val="18"/>
+              </w:rPr>
+              <w:t>4. Lalim at Rigor ng Aralin</w:t>
+            </w:r>
+          </w:p>
+        </w:tc>
+        <w:tc>
+          <w:tcPr>
+            <w:tcW w:type="dxa" w:w="2484"/>
+            <w:shd w:fill="F8FAFC"/>
+            <w:tcMar>
+              <w:top w:w="80" w:type="dxa"/>
+              <w:bottom w:w="80" w:type="dxa"/>
+              <w:left w:w="120" w:type="dxa"/>
+              <w:right w:w="120" w:type="dxa"/>
+            </w:tcMar>
+          </w:tcPr>
+          <w:p>
+            <w:pPr>
+              <w:spacing w:before="0" w:after="80" w:line="276" w:lineRule="auto"/>
+              <w:jc w:val="left"/>
+            </w:pPr>
+            <w:r>
+              <w:rPr>
+                <w:rFonts w:ascii="Cambria" w:hAnsi="Cambria"/>
+                <w:sz w:val="18"/>
+              </w:rPr>
+              <w:t>3,500+ salita bawat aralin, 8-10 turn Socratic dialogue, 4x4 rubrics.</w:t>
+            </w:r>
+          </w:p>
+        </w:tc>
+        <w:tc>
+          <w:tcPr>
+            <w:tcW w:type="dxa" w:w="2484"/>
+            <w:shd w:fill="F8FAFC"/>
+            <w:tcMar>
+              <w:top w:w="80" w:type="dxa"/>
+              <w:bottom w:w="80" w:type="dxa"/>
+              <w:left w:w="120" w:type="dxa"/>
+              <w:right w:w="120" w:type="dxa"/>
+            </w:tcMar>
+          </w:tcPr>
+          <w:p>
+            <w:pPr>
+              <w:spacing w:before="0" w:after="80" w:line="276" w:lineRule="auto"/>
+              <w:jc w:val="center"/>
+            </w:pPr>
+            <w:r>
+              <w:rPr>
+                <w:rFonts w:ascii="Cambria" w:hAnsi="Cambria"/>
+                <w:sz w:val="18"/>
+              </w:rPr>
+              <w:t>19 / 20</w:t>
+            </w:r>
+          </w:p>
+        </w:tc>
+        <w:tc>
+          <w:tcPr>
+            <w:tcW w:type="dxa" w:w="2484"/>
+            <w:shd w:fill="F8FAFC"/>
+            <w:tcMar>
+              <w:top w:w="80" w:type="dxa"/>
+              <w:bottom w:w="80" w:type="dxa"/>
+              <w:left w:w="120" w:type="dxa"/>
+              <w:right w:w="120" w:type="dxa"/>
+            </w:tcMar>
+          </w:tcPr>
+          <w:p>
+            <w:pPr>
+              <w:spacing w:before="0" w:after="80" w:line="276" w:lineRule="auto"/>
+              <w:jc w:val="center"/>
+            </w:pPr>
+            <w:r>
+              <w:rPr>
+                <w:rFonts w:ascii="Cambria" w:hAnsi="Cambria"/>
+                <w:b/>
+                <w:color w:val="1E7E34"/>
+                <w:sz w:val="18"/>
+              </w:rPr>
+              <w:t>PASADO (95%)</w:t>
+            </w:r>
+          </w:p>
+        </w:tc>
+      </w:tr>
+      <w:tr>
+        <w:trPr>
+          <w:cantSplit/>
+        </w:trPr>
+        <w:tc>
+          <w:tcPr>
+            <w:tcW w:type="dxa" w:w="2484"/>
+            <w:tcMar>
+              <w:top w:w="80" w:type="dxa"/>
+              <w:bottom w:w="80" w:type="dxa"/>
+              <w:left w:w="120" w:type="dxa"/>
+              <w:right w:w="120" w:type="dxa"/>
+            </w:tcMar>
+          </w:tcPr>
+          <w:p>
+            <w:pPr>
+              <w:spacing w:before="0" w:after="80" w:line="276" w:lineRule="auto"/>
+              <w:jc w:val="left"/>
+            </w:pPr>
+            <w:r>
+              <w:rPr>
+                <w:rFonts w:ascii="Cambria" w:hAnsi="Cambria"/>
+                <w:b/>
+                <w:sz w:val="18"/>
+              </w:rPr>
+              <w:t>5. Layout, Visuals at Susi</w:t>
+            </w:r>
+          </w:p>
+        </w:tc>
+        <w:tc>
+          <w:tcPr>
+            <w:tcW w:type="dxa" w:w="2484"/>
+            <w:tcMar>
+              <w:top w:w="80" w:type="dxa"/>
+              <w:bottom w:w="80" w:type="dxa"/>
+              <w:left w:w="120" w:type="dxa"/>
+              <w:right w:w="120" w:type="dxa"/>
+            </w:tcMar>
+          </w:tcPr>
+          <w:p>
+            <w:pPr>
+              <w:spacing w:before="0" w:after="80" w:line="276" w:lineRule="auto"/>
+              <w:jc w:val="left"/>
+            </w:pPr>
+            <w:r>
+              <w:rPr>
+                <w:rFonts w:ascii="Cambria" w:hAnsi="Cambria"/>
+                <w:sz w:val="18"/>
+              </w:rPr>
+              <w:t>3-tier pabalat, totoong YouTube search links, nakatalahanayang susi.</w:t>
+            </w:r>
+          </w:p>
+        </w:tc>
+        <w:tc>
+          <w:tcPr>
+            <w:tcW w:type="dxa" w:w="2484"/>
+            <w:tcMar>
+              <w:top w:w="80" w:type="dxa"/>
+              <w:bottom w:w="80" w:type="dxa"/>
+              <w:left w:w="120" w:type="dxa"/>
+              <w:right w:w="120" w:type="dxa"/>
+            </w:tcMar>
+          </w:tcPr>
+          <w:p>
+            <w:pPr>
+              <w:spacing w:before="0" w:after="80" w:line="276" w:lineRule="auto"/>
+              <w:jc w:val="center"/>
+            </w:pPr>
+            <w:r>
+              <w:rPr>
+                <w:rFonts w:ascii="Cambria" w:hAnsi="Cambria"/>
+                <w:sz w:val="18"/>
+              </w:rPr>
+              <w:t>20 / 20</w:t>
+            </w:r>
+          </w:p>
+        </w:tc>
+        <w:tc>
+          <w:tcPr>
+            <w:tcW w:type="dxa" w:w="2484"/>
+            <w:tcMar>
+              <w:top w:w="80" w:type="dxa"/>
+              <w:bottom w:w="80" w:type="dxa"/>
+              <w:left w:w="120" w:type="dxa"/>
+              <w:right w:w="120" w:type="dxa"/>
+            </w:tcMar>
+          </w:tcPr>
+          <w:p>
+            <w:pPr>
+              <w:spacing w:before="0" w:after="80" w:line="276" w:lineRule="auto"/>
+              <w:jc w:val="center"/>
+            </w:pPr>
+            <w:r>
+              <w:rPr>
+                <w:rFonts w:ascii="Cambria" w:hAnsi="Cambria"/>
+                <w:b/>
+                <w:color w:val="1E7E34"/>
+                <w:sz w:val="18"/>
+              </w:rPr>
+              <w:t>PASADO (100%)</w:t>
+            </w:r>
+          </w:p>
+        </w:tc>
+      </w:tr>
+      <w:tr>
+        <w:trPr>
+          <w:cantSplit/>
+        </w:trPr>
+        <w:tc>
+          <w:tcPr>
+            <w:tcW w:type="dxa" w:w="2484"/>
+            <w:shd w:fill="EBF3FA"/>
+            <w:tcMar>
+              <w:top w:w="80" w:type="dxa"/>
+              <w:bottom w:w="80" w:type="dxa"/>
+              <w:left w:w="120" w:type="dxa"/>
+              <w:right w:w="120" w:type="dxa"/>
+            </w:tcMar>
+          </w:tcPr>
+          <w:p>
+            <w:pPr>
+              <w:spacing w:before="0" w:after="80" w:line="276" w:lineRule="auto"/>
+              <w:jc w:val="left"/>
+            </w:pPr>
+            <w:r>
+              <w:rPr>
+                <w:rFonts w:ascii="Cambria" w:hAnsi="Cambria"/>
+                <w:b/>
+                <w:sz w:val="18"/>
+              </w:rPr>
+              <w:t>KABUUANG PUNTOS AT PASYA</w:t>
+            </w:r>
+          </w:p>
+        </w:tc>
+        <w:tc>
+          <w:tcPr>
+            <w:tcW w:type="dxa" w:w="2484"/>
+            <w:shd w:fill="EBF3FA"/>
+            <w:tcMar>
+              <w:top w:w="80" w:type="dxa"/>
+              <w:bottom w:w="80" w:type="dxa"/>
+              <w:left w:w="120" w:type="dxa"/>
+              <w:right w:w="120" w:type="dxa"/>
+            </w:tcMar>
+          </w:tcPr>
+          <w:p>
+            <w:pPr>
+              <w:spacing w:before="0" w:after="80" w:line="276" w:lineRule="auto"/>
+              <w:jc w:val="left"/>
+            </w:pPr>
+            <w:r>
+              <w:rPr>
+                <w:rFonts w:ascii="Cambria" w:hAnsi="Cambria"/>
+                <w:b/>
+                <w:sz w:val="18"/>
+              </w:rPr>
+              <w:t>DEPED MATATAG CURRICULUM COMPLIANCE AUDIT RATING</w:t>
+            </w:r>
+          </w:p>
+        </w:tc>
+        <w:tc>
+          <w:tcPr>
+            <w:tcW w:type="dxa" w:w="2484"/>
+            <w:shd w:fill="EBF3FA"/>
+            <w:tcMar>
+              <w:top w:w="80" w:type="dxa"/>
+              <w:bottom w:w="80" w:type="dxa"/>
+              <w:left w:w="120" w:type="dxa"/>
+              <w:right w:w="120" w:type="dxa"/>
+            </w:tcMar>
+          </w:tcPr>
+          <w:p>
+            <w:pPr>
+              <w:spacing w:before="0" w:after="80" w:line="276" w:lineRule="auto"/>
+              <w:jc w:val="center"/>
+            </w:pPr>
+            <w:r>
+              <w:rPr>
+                <w:rFonts w:ascii="Cambria" w:hAnsi="Cambria"/>
+                <w:b/>
+                <w:sz w:val="18"/>
+              </w:rPr>
+              <w:t>99 / 100</w:t>
+            </w:r>
+          </w:p>
+        </w:tc>
+        <w:tc>
+          <w:tcPr>
+            <w:tcW w:type="dxa" w:w="2484"/>
+            <w:shd w:fill="EBF3FA"/>
+            <w:tcMar>
+              <w:top w:w="80" w:type="dxa"/>
+              <w:bottom w:w="80" w:type="dxa"/>
+              <w:left w:w="120" w:type="dxa"/>
+              <w:right w:w="120" w:type="dxa"/>
+            </w:tcMar>
+          </w:tcPr>
+          <w:p>
+            <w:pPr>
+              <w:spacing w:before="0" w:after="80" w:line="276" w:lineRule="auto"/>
+              <w:jc w:val="center"/>
+            </w:pPr>
+            <w:r>
+              <w:rPr>
+                <w:rFonts w:ascii="Cambria" w:hAnsi="Cambria"/>
+                <w:b/>
+                <w:color w:val="1E7E34"/>
+                <w:sz w:val="18"/>
+              </w:rPr>
+              <w:t>CERTIFIED (PASSED)</w:t>
+            </w:r>
+          </w:p>
+        </w:tc>
+      </w:tr>
+    </w:tbl>
     <w:sectPr>
       <w:headerReference w:type="default" r:id="rId9"/>
       <w:footerReference w:type="default" r:id="rId10"/>
@@ -27845,7 +29043,7 @@
         <w:color w:val="777777"/>
         <w:sz w:val="17"/>
       </w:rPr>
-      <w:t>DepEd MATATAG Curriculum • Public Edition / Edisyong Pampubliko</w:t>
+      <w:t>DepEd MATATAG Curriculum • Edisyong Pampubliko (Baitang 7)</w:t>
     </w:r>
   </w:p>
 </w:ftr>

</xml_diff>